<commit_message>
Evidencia individual Nicolás Cárdenas
Evidencia individual Nicolás Cárdenas
</commit_message>
<xml_diff>
--- a/Fase 2/Evidencias individuales/Cardenas_Nicolas_2.1_APT122_DiarioReflexionFase2.docx
+++ b/Fase 2/Evidencias individuales/Cardenas_Nicolas_2.1_APT122_DiarioReflexionFase2.docx
@@ -1,6 +1,6 @@
 
 <file path=word/document.xml><?xml version="1.0" encoding="utf-8"?>
-<w:document xmlns:wpc="http://schemas.microsoft.com/office/word/2010/wordprocessingCanvas" xmlns:cx="http://schemas.microsoft.com/office/drawing/2014/chartex" xmlns:mc="http://schemas.openxmlformats.org/markup-compatibility/2006" xmlns:o="urn:schemas-microsoft-com:office:office" xmlns:r="http://schemas.openxmlformats.org/officeDocument/2006/relationships" xmlns:m="http://schemas.openxmlformats.org/officeDocument/2006/math" xmlns:v="urn:schemas-microsoft-com:vml" xmlns:wp14="http://schemas.microsoft.com/office/word/2010/wordprocessingDrawing" xmlns:wp="http://schemas.openxmlformats.org/drawingml/2006/wordprocessingDrawing" xmlns:w10="urn:schemas-microsoft-com:office:word" xmlns:w="http://schemas.openxmlformats.org/wordprocessingml/2006/main" xmlns:w14="http://schemas.microsoft.com/office/word/2010/wordml" xmlns:w15="http://schemas.microsoft.com/office/word/2012/wordml" xmlns:w16se="http://schemas.microsoft.com/office/word/2015/wordml/symex" xmlns:wpg="http://schemas.microsoft.com/office/word/2010/wordprocessingGroup" xmlns:wpi="http://schemas.microsoft.com/office/word/2010/wordprocessingInk" xmlns:wne="http://schemas.microsoft.com/office/word/2006/wordml" xmlns:wps="http://schemas.microsoft.com/office/word/2010/wordprocessingShape" mc:Ignorable="w14 w15 w16se wp14">
+<w:document xmlns:wpc="http://schemas.microsoft.com/office/word/2010/wordprocessingCanvas" xmlns:cx="http://schemas.microsoft.com/office/drawing/2014/chartex" xmlns:cx1="http://schemas.microsoft.com/office/drawing/2015/9/8/chartex" xmlns:cx2="http://schemas.microsoft.com/office/drawing/2015/10/21/chartex" xmlns:cx3="http://schemas.microsoft.com/office/drawing/2016/5/9/chartex" xmlns:cx4="http://schemas.microsoft.com/office/drawing/2016/5/10/chartex" xmlns:cx5="http://schemas.microsoft.com/office/drawing/2016/5/11/chartex" xmlns:cx6="http://schemas.microsoft.com/office/drawing/2016/5/12/chartex" xmlns:cx7="http://schemas.microsoft.com/office/drawing/2016/5/13/chartex" xmlns:cx8="http://schemas.microsoft.com/office/drawing/2016/5/14/chartex" xmlns:mc="http://schemas.openxmlformats.org/markup-compatibility/2006" xmlns:aink="http://schemas.microsoft.com/office/drawing/2016/ink" xmlns:am3d="http://schemas.microsoft.com/office/drawing/2017/model3d" xmlns:o="urn:schemas-microsoft-com:office:office" xmlns:oel="http://schemas.microsoft.com/office/2019/extlst" xmlns:r="http://schemas.openxmlformats.org/officeDocument/2006/relationships" xmlns:m="http://schemas.openxmlformats.org/officeDocument/2006/math" xmlns:v="urn:schemas-microsoft-com:vml" xmlns:wp14="http://schemas.microsoft.com/office/word/2010/wordprocessingDrawing" xmlns:wp="http://schemas.openxmlformats.org/drawingml/2006/wordprocessingDrawing" xmlns:w10="urn:schemas-microsoft-com:office:word" xmlns:w="http://schemas.openxmlformats.org/wordprocessingml/2006/main" xmlns:w14="http://schemas.microsoft.com/office/word/2010/wordml" xmlns:w15="http://schemas.microsoft.com/office/word/2012/wordml" xmlns:w16cex="http://schemas.microsoft.com/office/word/2018/wordml/cex" xmlns:w16cid="http://schemas.microsoft.com/office/word/2016/wordml/cid" xmlns:w16="http://schemas.microsoft.com/office/word/2018/wordml" xmlns:w16du="http://schemas.microsoft.com/office/word/2023/wordml/word16du" xmlns:w16sdtdh="http://schemas.microsoft.com/office/word/2020/wordml/sdtdatahash" xmlns:w16sdtfl="http://schemas.microsoft.com/office/word/2024/wordml/sdtformatlock" xmlns:w16se="http://schemas.microsoft.com/office/word/2015/wordml/symex" xmlns:wpg="http://schemas.microsoft.com/office/word/2010/wordprocessingGroup" xmlns:wpi="http://schemas.microsoft.com/office/word/2010/wordprocessingInk" xmlns:wne="http://schemas.microsoft.com/office/word/2006/wordml" xmlns:wps="http://schemas.microsoft.com/office/word/2010/wordprocessingShape" mc:Ignorable="w14 w15 w16se w16cid w16 w16cex w16sdtdh w16sdtfl w16du wp14">
   <w:body>
     <w:p/>
     <w:tbl>
@@ -306,7 +306,6 @@
               <w:jc w:val="both"/>
               <w:rPr>
                 <w:rFonts w:eastAsiaTheme="majorEastAsia"/>
-                <w:color w:val="767171" w:themeColor="background2" w:themeShade="80"/>
                 <w:sz w:val="24"/>
                 <w:szCs w:val="24"/>
               </w:rPr>
@@ -335,23 +334,51 @@
             <w:pPr>
               <w:jc w:val="both"/>
               <w:rPr>
-                <w:rFonts w:ascii="Calibri" w:hAnsi="Calibri"/>
-                <w:b/>
-                <w:bCs/>
-                <w:color w:val="1F4E79" w:themeColor="accent1" w:themeShade="80"/>
+                <w:rFonts w:eastAsiaTheme="majorEastAsia"/>
+                <w:sz w:val="24"/>
+                <w:szCs w:val="24"/>
               </w:rPr>
             </w:pPr>
-          </w:p>
-          <w:p>
-            <w:pPr>
-              <w:jc w:val="both"/>
+            <w:r>
               <w:rPr>
-                <w:rFonts w:ascii="Calibri" w:hAnsi="Calibri"/>
-                <w:b/>
-                <w:bCs/>
-                <w:color w:val="1F4E79" w:themeColor="accent1" w:themeShade="80"/>
+                <w:rFonts w:eastAsiaTheme="majorEastAsia"/>
+                <w:sz w:val="24"/>
+                <w:szCs w:val="24"/>
               </w:rPr>
-            </w:pPr>
+              <w:t>En líneas generales cumplí las actividades a mi cargo, aunque con algunos desfases. Completé en los plazos los módulos de backend que me correspondieron —el catálogo de análisis, la asignación de análisis a muestras, el ingreso de resultados con validación automática de rangos (RF02/RF03) y el flujo de aprobación (RF04</w:t>
+            </w:r>
+            <w:r>
+              <w:rPr>
+                <w:rFonts w:eastAsiaTheme="majorEastAsia"/>
+                <w:sz w:val="24"/>
+                <w:szCs w:val="24"/>
+              </w:rPr>
+              <w:t xml:space="preserve">. </w:t>
+            </w:r>
+            <w:r>
+              <w:rPr>
+                <w:rFonts w:eastAsiaTheme="majorEastAsia"/>
+                <w:sz w:val="24"/>
+                <w:szCs w:val="24"/>
+              </w:rPr>
+              <w:t xml:space="preserve">La actividad que quedó con </w:t>
+            </w:r>
+            <w:r>
+              <w:rPr>
+                <w:rFonts w:eastAsiaTheme="majorEastAsia"/>
+                <w:sz w:val="24"/>
+                <w:szCs w:val="24"/>
+              </w:rPr>
+              <w:t xml:space="preserve">retrasada </w:t>
+            </w:r>
+            <w:r>
+              <w:rPr>
+                <w:rFonts w:eastAsiaTheme="majorEastAsia"/>
+                <w:sz w:val="24"/>
+                <w:szCs w:val="24"/>
+              </w:rPr>
+              <w:t>respecto a lo planificado fue el testing automatizado (JUnit), que aún no inicio. Como factor facilitador destaco la división clara de roles desde el inicio y el uso de control de versiones con ramas y Pull Requests, que me permitió integrar mi trabajo sin interferir con el de mis compañeros. La principal dificultad fue técnica: la gestión del esquema de base de datos entre los distintos equipos, que al no tener migraciones automáticas obligaba a actualizaciones manuales y generó errores al integrar cambios grandes.</w:t>
+            </w:r>
           </w:p>
           <w:p>
             <w:pPr>
@@ -442,7 +469,6 @@
               <w:jc w:val="both"/>
               <w:rPr>
                 <w:rFonts w:eastAsiaTheme="majorEastAsia"/>
-                <w:color w:val="767171" w:themeColor="background2" w:themeShade="80"/>
                 <w:sz w:val="24"/>
                 <w:szCs w:val="24"/>
               </w:rPr>
@@ -460,10 +486,10 @@
             <w:pPr>
               <w:jc w:val="both"/>
               <w:rPr>
-                <w:rFonts w:ascii="Calibri" w:hAnsi="Calibri"/>
-                <w:b/>
-                <w:bCs/>
-                <w:color w:val="1F4E79" w:themeColor="accent1" w:themeShade="80"/>
+                <w:rFonts w:eastAsiaTheme="majorEastAsia"/>
+                <w:color w:val="767171" w:themeColor="background2" w:themeShade="80"/>
+                <w:sz w:val="24"/>
+                <w:szCs w:val="24"/>
               </w:rPr>
             </w:pPr>
           </w:p>
@@ -471,23 +497,45 @@
             <w:pPr>
               <w:jc w:val="both"/>
               <w:rPr>
-                <w:rFonts w:ascii="Calibri" w:hAnsi="Calibri"/>
-                <w:b/>
-                <w:bCs/>
-                <w:color w:val="1F4E79" w:themeColor="accent1" w:themeShade="80"/>
+                <w:rFonts w:eastAsiaTheme="majorEastAsia"/>
+                <w:sz w:val="24"/>
+                <w:szCs w:val="24"/>
               </w:rPr>
             </w:pPr>
+            <w:r>
+              <w:rPr>
+                <w:rFonts w:eastAsiaTheme="majorEastAsia"/>
+                <w:sz w:val="24"/>
+                <w:szCs w:val="24"/>
+              </w:rPr>
+              <w:t>Frente a la dificultad del esquema de base de datos, documenté el procedimiento para recrear y actualizar la base, de modo que cualquier integrante pueda dejar su entorno al día</w:t>
+            </w:r>
+            <w:r>
+              <w:rPr>
+                <w:rFonts w:eastAsiaTheme="majorEastAsia"/>
+                <w:sz w:val="24"/>
+                <w:szCs w:val="24"/>
+              </w:rPr>
+              <w:t xml:space="preserve">. </w:t>
+            </w:r>
           </w:p>
           <w:p>
             <w:pPr>
               <w:jc w:val="both"/>
               <w:rPr>
-                <w:rFonts w:ascii="Calibri" w:hAnsi="Calibri"/>
-                <w:b/>
-                <w:bCs/>
-                <w:color w:val="1F4E79" w:themeColor="accent1" w:themeShade="80"/>
+                <w:rFonts w:eastAsiaTheme="majorEastAsia"/>
+                <w:sz w:val="24"/>
+                <w:szCs w:val="24"/>
               </w:rPr>
             </w:pPr>
+            <w:r>
+              <w:rPr>
+                <w:rFonts w:eastAsiaTheme="majorEastAsia"/>
+                <w:sz w:val="24"/>
+                <w:szCs w:val="24"/>
+              </w:rPr>
+              <w:t>Frente al cambio de dominio exigido por la retroalimentación, participé en la redefinición del modelo de datos y en el reparto de las nuevas tareas. Para enfrentar el retraso en las pruebas automatizadas, planeo concentrarlas en la Fase 5, priorizando las clases con lógica de negocio crítica (validación de rangos y reglas de aprobación), que son las de mayor valor para certificar el sistema.</w:t>
+            </w:r>
           </w:p>
           <w:p>
             <w:pPr>
@@ -503,102 +551,6 @@
         </w:tc>
       </w:tr>
     </w:tbl>
-    <w:p>
-      <w:pPr>
-        <w:spacing w:after="0" w:line="360" w:lineRule="auto"/>
-        <w:jc w:val="both"/>
-        <w:rPr>
-          <w:color w:val="595959" w:themeColor="text1" w:themeTint="A6"/>
-          <w:sz w:val="24"/>
-          <w:szCs w:val="24"/>
-          <w:lang w:eastAsia="ja-JP"/>
-        </w:rPr>
-      </w:pPr>
-    </w:p>
-    <w:p>
-      <w:pPr>
-        <w:spacing w:after="0" w:line="360" w:lineRule="auto"/>
-        <w:jc w:val="both"/>
-        <w:rPr>
-          <w:b/>
-          <w:bCs/>
-          <w:sz w:val="24"/>
-          <w:szCs w:val="24"/>
-        </w:rPr>
-      </w:pPr>
-    </w:p>
-    <w:p>
-      <w:pPr>
-        <w:spacing w:after="0" w:line="360" w:lineRule="auto"/>
-        <w:jc w:val="both"/>
-        <w:rPr>
-          <w:b/>
-          <w:bCs/>
-          <w:sz w:val="24"/>
-          <w:szCs w:val="24"/>
-        </w:rPr>
-      </w:pPr>
-    </w:p>
-    <w:p>
-      <w:pPr>
-        <w:spacing w:after="0" w:line="360" w:lineRule="auto"/>
-        <w:jc w:val="both"/>
-        <w:rPr>
-          <w:b/>
-          <w:bCs/>
-          <w:sz w:val="24"/>
-          <w:szCs w:val="24"/>
-        </w:rPr>
-      </w:pPr>
-    </w:p>
-    <w:p>
-      <w:pPr>
-        <w:spacing w:after="0" w:line="360" w:lineRule="auto"/>
-        <w:jc w:val="both"/>
-        <w:rPr>
-          <w:b/>
-          <w:bCs/>
-          <w:sz w:val="24"/>
-          <w:szCs w:val="24"/>
-        </w:rPr>
-      </w:pPr>
-    </w:p>
-    <w:p>
-      <w:pPr>
-        <w:spacing w:after="0" w:line="360" w:lineRule="auto"/>
-        <w:jc w:val="both"/>
-        <w:rPr>
-          <w:b/>
-          <w:bCs/>
-          <w:sz w:val="24"/>
-          <w:szCs w:val="24"/>
-        </w:rPr>
-      </w:pPr>
-    </w:p>
-    <w:p>
-      <w:pPr>
-        <w:spacing w:after="0" w:line="360" w:lineRule="auto"/>
-        <w:jc w:val="both"/>
-        <w:rPr>
-          <w:b/>
-          <w:bCs/>
-          <w:sz w:val="24"/>
-          <w:szCs w:val="24"/>
-        </w:rPr>
-      </w:pPr>
-    </w:p>
-    <w:p>
-      <w:pPr>
-        <w:spacing w:after="0" w:line="360" w:lineRule="auto"/>
-        <w:jc w:val="both"/>
-        <w:rPr>
-          <w:b/>
-          <w:bCs/>
-          <w:sz w:val="24"/>
-          <w:szCs w:val="24"/>
-        </w:rPr>
-      </w:pPr>
-    </w:p>
     <w:p>
       <w:pPr>
         <w:spacing w:after="0" w:line="360" w:lineRule="auto"/>
@@ -654,6 +606,7 @@
                 <w:sz w:val="24"/>
                 <w:szCs w:val="24"/>
               </w:rPr>
+              <w:lastRenderedPageBreak/>
               <w:t>3. Hasta el momento:</w:t>
             </w:r>
           </w:p>
@@ -685,7 +638,6 @@
                 <w:sz w:val="24"/>
                 <w:szCs w:val="24"/>
               </w:rPr>
-              <w:lastRenderedPageBreak/>
               <w:t>¿Cómo evalúas tu</w:t>
             </w:r>
             <w:r>
@@ -737,33 +689,18 @@
               <w:jc w:val="both"/>
               <w:rPr>
                 <w:rFonts w:ascii="Calibri" w:hAnsi="Calibri"/>
-                <w:b/>
-                <w:bCs/>
-                <w:color w:val="1F4E79" w:themeColor="accent1" w:themeShade="80"/>
+                <w:sz w:val="24"/>
+                <w:szCs w:val="24"/>
               </w:rPr>
             </w:pPr>
-          </w:p>
-          <w:p>
-            <w:pPr>
-              <w:jc w:val="both"/>
+            <w:r>
               <w:rPr>
                 <w:rFonts w:ascii="Calibri" w:hAnsi="Calibri"/>
-                <w:b/>
-                <w:bCs/>
-                <w:color w:val="1F4E79" w:themeColor="accent1" w:themeShade="80"/>
+                <w:sz w:val="24"/>
+                <w:szCs w:val="24"/>
               </w:rPr>
-            </w:pPr>
-          </w:p>
-          <w:p>
-            <w:pPr>
-              <w:jc w:val="both"/>
-              <w:rPr>
-                <w:rFonts w:ascii="Calibri" w:hAnsi="Calibri"/>
-                <w:b/>
-                <w:bCs/>
-                <w:color w:val="1F4E79" w:themeColor="accent1" w:themeShade="80"/>
-              </w:rPr>
-            </w:pPr>
+              <w:t>Evalúo mi trabajo de manera positiva en cuanto a cumplimiento y aporte técnico: contribuí con varios módulos centrales del backend y con el aseguramiento de calidad del sistema completo, verificando los flujos de extremo a extremo y levantando hallazgos de mejora. Destaco mi capacidad de entender el sistema de forma integral (no solo mi parte) y de documentar lo que iba probando. Como aspecto a mejorar, reconozco que dejé el testing automatizado para el final, cuando habría sido más sano avanzarlo en paralelo al desarrollo; es un aprendizaje que quiero corregir en las próximas fases. También podría mejorar en comunicar antes al equipo los problemas técnicos que detecto, para resolverlos de forma más temprana.</w:t>
+            </w:r>
           </w:p>
         </w:tc>
       </w:tr>
@@ -874,44 +811,51 @@
               <w:jc w:val="both"/>
               <w:rPr>
                 <w:rFonts w:ascii="Calibri" w:hAnsi="Calibri"/>
-                <w:b/>
-                <w:bCs/>
-                <w:color w:val="1F4E79" w:themeColor="accent1" w:themeShade="80"/>
+                <w:sz w:val="24"/>
+                <w:szCs w:val="24"/>
               </w:rPr>
             </w:pPr>
+            <w:r>
+              <w:rPr>
+                <w:rFonts w:ascii="Calibri" w:hAnsi="Calibri"/>
+                <w:sz w:val="24"/>
+                <w:szCs w:val="24"/>
+              </w:rPr>
+              <w:t>Me queda la inquietud de cuánta profundidad de pruebas automatizadas se espera para el alcance de un MVP de 12 semanas, y cómo equilibrar eso con el tiempo restante.</w:t>
+            </w:r>
+            <w:r>
+              <w:rPr>
+                <w:rFonts w:ascii="Calibri" w:hAnsi="Calibri"/>
+                <w:sz w:val="24"/>
+                <w:szCs w:val="24"/>
+              </w:rPr>
+              <w:br/>
+              <w:t>Y como pregunta al docente</w:t>
+            </w:r>
+            <w:r>
+              <w:rPr>
+                <w:rFonts w:ascii="Calibri" w:hAnsi="Calibri"/>
+                <w:sz w:val="24"/>
+                <w:szCs w:val="24"/>
+              </w:rPr>
+              <w:t xml:space="preserve">, ¿es suficiente con pruebas unitarias sobre la lógica de negocio crítica, o se espera también una cobertura de pruebas de integración más amplia? </w:t>
+            </w:r>
           </w:p>
           <w:p>
             <w:pPr>
               <w:jc w:val="both"/>
               <w:rPr>
                 <w:rFonts w:ascii="Calibri" w:hAnsi="Calibri"/>
-                <w:b/>
-                <w:bCs/>
-                <w:color w:val="1F4E79" w:themeColor="accent1" w:themeShade="80"/>
               </w:rPr>
             </w:pPr>
-          </w:p>
-          <w:p>
-            <w:pPr>
-              <w:jc w:val="both"/>
+            <w:r>
               <w:rPr>
                 <w:rFonts w:ascii="Calibri" w:hAnsi="Calibri"/>
-                <w:b/>
-                <w:bCs/>
-                <w:color w:val="1F4E79" w:themeColor="accent1" w:themeShade="80"/>
+                <w:sz w:val="24"/>
+                <w:szCs w:val="24"/>
               </w:rPr>
-            </w:pPr>
-          </w:p>
-          <w:p>
-            <w:pPr>
-              <w:jc w:val="both"/>
-              <w:rPr>
-                <w:rFonts w:ascii="Calibri" w:hAnsi="Calibri"/>
-                <w:b/>
-                <w:bCs/>
-                <w:color w:val="1F4E79" w:themeColor="accent1" w:themeShade="80"/>
-              </w:rPr>
-            </w:pPr>
+              <w:t>También me interesa validar con el docente si la reorientación de dominio que hicimos responde adecuadamente a su retroalimentación anterior.</w:t>
+            </w:r>
           </w:p>
         </w:tc>
       </w:tr>
@@ -1003,7 +947,6 @@
               <w:jc w:val="both"/>
               <w:rPr>
                 <w:rFonts w:eastAsiaTheme="majorEastAsia"/>
-                <w:color w:val="767171" w:themeColor="background2" w:themeShade="80"/>
                 <w:sz w:val="24"/>
                 <w:szCs w:val="24"/>
               </w:rPr>
@@ -1022,7 +965,6 @@
               <w:jc w:val="both"/>
               <w:rPr>
                 <w:rFonts w:eastAsiaTheme="majorEastAsia"/>
-                <w:color w:val="767171" w:themeColor="background2" w:themeShade="80"/>
                 <w:sz w:val="24"/>
                 <w:szCs w:val="24"/>
               </w:rPr>
@@ -1033,18 +975,40 @@
               <w:jc w:val="both"/>
               <w:rPr>
                 <w:rFonts w:eastAsiaTheme="majorEastAsia"/>
-                <w:color w:val="767171" w:themeColor="background2" w:themeShade="80"/>
                 <w:sz w:val="24"/>
                 <w:szCs w:val="24"/>
               </w:rPr>
             </w:pPr>
+            <w:r>
+              <w:rPr>
+                <w:rFonts w:eastAsiaTheme="majorEastAsia"/>
+                <w:sz w:val="24"/>
+                <w:szCs w:val="24"/>
+              </w:rPr>
+              <w:t xml:space="preserve">Sí, el cambio de dominio generó actividades nuevas que convino repartir: la entidad “investigador” y la cadena de custodia (backend y cliente), y la validación de los parámetros reales de muestreo de algas. En la práctica, algunas tareas se reasignaron respecto al plan original —por ejemplo, tomé módulos de backend </w:t>
+            </w:r>
+            <w:r>
+              <w:rPr>
+                <w:rFonts w:eastAsiaTheme="majorEastAsia"/>
+                <w:sz w:val="24"/>
+                <w:szCs w:val="24"/>
+              </w:rPr>
+              <w:t>y frontend</w:t>
+            </w:r>
+            <w:r>
+              <w:rPr>
+                <w:rFonts w:eastAsiaTheme="majorEastAsia"/>
+                <w:sz w:val="24"/>
+                <w:szCs w:val="24"/>
+              </w:rPr>
+              <w:t xml:space="preserve"> que inicialmente estaban asignados a otro integrante—, lo que considero adecuado porque equilibró la carga. De cara a las próximas fases, propongo asignar formalmente la validación del catálogo de parámetros reales (con fuente) y las pruebas automatizadas, que son las actividades críticas pendientes.</w:t>
+            </w:r>
           </w:p>
           <w:p>
             <w:pPr>
               <w:jc w:val="both"/>
               <w:rPr>
                 <w:rFonts w:eastAsiaTheme="majorEastAsia"/>
-                <w:color w:val="767171" w:themeColor="background2" w:themeShade="80"/>
                 <w:sz w:val="24"/>
                 <w:szCs w:val="24"/>
               </w:rPr>
@@ -1131,6 +1095,7 @@
                 <w:sz w:val="24"/>
                 <w:szCs w:val="24"/>
               </w:rPr>
+              <w:lastRenderedPageBreak/>
               <w:t>6</w:t>
             </w:r>
             <w:r>
@@ -1141,8 +1106,6 @@
               </w:rPr>
               <w:t>. APT  grupal</w:t>
             </w:r>
-            <w:bookmarkStart w:id="0" w:name="_GoBack"/>
-            <w:bookmarkEnd w:id="0"/>
           </w:p>
         </w:tc>
       </w:tr>
@@ -1191,22 +1154,18 @@
               <w:jc w:val="both"/>
               <w:rPr>
                 <w:rFonts w:eastAsiaTheme="majorEastAsia"/>
-                <w:color w:val="767171" w:themeColor="background2" w:themeShade="80"/>
                 <w:sz w:val="24"/>
                 <w:szCs w:val="24"/>
               </w:rPr>
             </w:pPr>
-          </w:p>
-          <w:p>
-            <w:pPr>
-              <w:jc w:val="both"/>
+            <w:r>
               <w:rPr>
                 <w:rFonts w:eastAsiaTheme="majorEastAsia"/>
-                <w:color w:val="767171" w:themeColor="background2" w:themeShade="80"/>
                 <w:sz w:val="24"/>
                 <w:szCs w:val="24"/>
               </w:rPr>
-            </w:pPr>
+              <w:t>Evalúo positivamente el trabajo en equipo: logramos avanzar en paralelo gracias a una división de roles clara (backend, cliente y QA/documentación) y mantuvimos una integración ordenada mediante control de versiones. Destaco la disposición a apoyarnos en los puntos de contacto entre el cliente y el backend, y la capacidad del grupo para reaccionar al cambio de dominio sin perder el ritmo. Como aspecto a mejorar, creo que podríamos coordinar mejor los cambios que afectan a todos —como las modificaciones al esquema de base de datos—, avisándonos con anticipación para evitar errores de integración. También nos beneficiaría cerrar cada sprint con una revisión conjunta más formal de lo avanzado.</w:t>
+            </w:r>
           </w:p>
           <w:p>
             <w:pPr>
@@ -1272,7 +1231,7 @@
 </file>
 
 <file path=word/endnotes.xml><?xml version="1.0" encoding="utf-8"?>
-<w:endnotes xmlns:wpc="http://schemas.microsoft.com/office/word/2010/wordprocessingCanvas" xmlns:cx="http://schemas.microsoft.com/office/drawing/2014/chartex" xmlns:mc="http://schemas.openxmlformats.org/markup-compatibility/2006" xmlns:o="urn:schemas-microsoft-com:office:office" xmlns:r="http://schemas.openxmlformats.org/officeDocument/2006/relationships" xmlns:m="http://schemas.openxmlformats.org/officeDocument/2006/math" xmlns:v="urn:schemas-microsoft-com:vml" xmlns:wp14="http://schemas.microsoft.com/office/word/2010/wordprocessingDrawing" xmlns:wp="http://schemas.openxmlformats.org/drawingml/2006/wordprocessingDrawing" xmlns:w10="urn:schemas-microsoft-com:office:word" xmlns:w="http://schemas.openxmlformats.org/wordprocessingml/2006/main" xmlns:w14="http://schemas.microsoft.com/office/word/2010/wordml" xmlns:w15="http://schemas.microsoft.com/office/word/2012/wordml" xmlns:w16se="http://schemas.microsoft.com/office/word/2015/wordml/symex" xmlns:wpg="http://schemas.microsoft.com/office/word/2010/wordprocessingGroup" xmlns:wpi="http://schemas.microsoft.com/office/word/2010/wordprocessingInk" xmlns:wne="http://schemas.microsoft.com/office/word/2006/wordml" xmlns:wps="http://schemas.microsoft.com/office/word/2010/wordprocessingShape" mc:Ignorable="w14 w15 w16se wp14">
+<w:endnotes xmlns:wpc="http://schemas.microsoft.com/office/word/2010/wordprocessingCanvas" xmlns:cx="http://schemas.microsoft.com/office/drawing/2014/chartex" xmlns:cx1="http://schemas.microsoft.com/office/drawing/2015/9/8/chartex" xmlns:cx2="http://schemas.microsoft.com/office/drawing/2015/10/21/chartex" xmlns:cx3="http://schemas.microsoft.com/office/drawing/2016/5/9/chartex" xmlns:cx4="http://schemas.microsoft.com/office/drawing/2016/5/10/chartex" xmlns:cx5="http://schemas.microsoft.com/office/drawing/2016/5/11/chartex" xmlns:cx6="http://schemas.microsoft.com/office/drawing/2016/5/12/chartex" xmlns:cx7="http://schemas.microsoft.com/office/drawing/2016/5/13/chartex" xmlns:cx8="http://schemas.microsoft.com/office/drawing/2016/5/14/chartex" xmlns:mc="http://schemas.openxmlformats.org/markup-compatibility/2006" xmlns:aink="http://schemas.microsoft.com/office/drawing/2016/ink" xmlns:am3d="http://schemas.microsoft.com/office/drawing/2017/model3d" xmlns:o="urn:schemas-microsoft-com:office:office" xmlns:oel="http://schemas.microsoft.com/office/2019/extlst" xmlns:r="http://schemas.openxmlformats.org/officeDocument/2006/relationships" xmlns:m="http://schemas.openxmlformats.org/officeDocument/2006/math" xmlns:v="urn:schemas-microsoft-com:vml" xmlns:wp14="http://schemas.microsoft.com/office/word/2010/wordprocessingDrawing" xmlns:wp="http://schemas.openxmlformats.org/drawingml/2006/wordprocessingDrawing" xmlns:w10="urn:schemas-microsoft-com:office:word" xmlns:w="http://schemas.openxmlformats.org/wordprocessingml/2006/main" xmlns:w14="http://schemas.microsoft.com/office/word/2010/wordml" xmlns:w15="http://schemas.microsoft.com/office/word/2012/wordml" xmlns:w16cex="http://schemas.microsoft.com/office/word/2018/wordml/cex" xmlns:w16cid="http://schemas.microsoft.com/office/word/2016/wordml/cid" xmlns:w16="http://schemas.microsoft.com/office/word/2018/wordml" xmlns:w16du="http://schemas.microsoft.com/office/word/2023/wordml/word16du" xmlns:w16sdtdh="http://schemas.microsoft.com/office/word/2020/wordml/sdtdatahash" xmlns:w16sdtfl="http://schemas.microsoft.com/office/word/2024/wordml/sdtformatlock" xmlns:w16se="http://schemas.microsoft.com/office/word/2015/wordml/symex" xmlns:wpg="http://schemas.microsoft.com/office/word/2010/wordprocessingGroup" xmlns:wpi="http://schemas.microsoft.com/office/word/2010/wordprocessingInk" xmlns:wne="http://schemas.microsoft.com/office/word/2006/wordml" xmlns:wps="http://schemas.microsoft.com/office/word/2010/wordprocessingShape" mc:Ignorable="w14 w15 w16se w16cid w16 w16cex w16sdtdh w16sdtfl w16du wp14">
   <w:endnote w:type="separator" w:id="-1">
     <w:p>
       <w:pPr>
@@ -1297,7 +1256,7 @@
 </file>
 
 <file path=word/footer1.xml><?xml version="1.0" encoding="utf-8"?>
-<w:ftr xmlns:wpc="http://schemas.microsoft.com/office/word/2010/wordprocessingCanvas" xmlns:cx="http://schemas.microsoft.com/office/drawing/2014/chartex" xmlns:mc="http://schemas.openxmlformats.org/markup-compatibility/2006" xmlns:o="urn:schemas-microsoft-com:office:office" xmlns:r="http://schemas.openxmlformats.org/officeDocument/2006/relationships" xmlns:m="http://schemas.openxmlformats.org/officeDocument/2006/math" xmlns:v="urn:schemas-microsoft-com:vml" xmlns:wp14="http://schemas.microsoft.com/office/word/2010/wordprocessingDrawing" xmlns:wp="http://schemas.openxmlformats.org/drawingml/2006/wordprocessingDrawing" xmlns:w10="urn:schemas-microsoft-com:office:word" xmlns:w="http://schemas.openxmlformats.org/wordprocessingml/2006/main" xmlns:w14="http://schemas.microsoft.com/office/word/2010/wordml" xmlns:w15="http://schemas.microsoft.com/office/word/2012/wordml" xmlns:w16se="http://schemas.microsoft.com/office/word/2015/wordml/symex" xmlns:wpg="http://schemas.microsoft.com/office/word/2010/wordprocessingGroup" xmlns:wpi="http://schemas.microsoft.com/office/word/2010/wordprocessingInk" xmlns:wne="http://schemas.microsoft.com/office/word/2006/wordml" xmlns:wps="http://schemas.microsoft.com/office/word/2010/wordprocessingShape" mc:Ignorable="w14 w15 w16se wp14">
+<w:ftr xmlns:wpc="http://schemas.microsoft.com/office/word/2010/wordprocessingCanvas" xmlns:cx="http://schemas.microsoft.com/office/drawing/2014/chartex" xmlns:cx1="http://schemas.microsoft.com/office/drawing/2015/9/8/chartex" xmlns:cx2="http://schemas.microsoft.com/office/drawing/2015/10/21/chartex" xmlns:cx3="http://schemas.microsoft.com/office/drawing/2016/5/9/chartex" xmlns:cx4="http://schemas.microsoft.com/office/drawing/2016/5/10/chartex" xmlns:cx5="http://schemas.microsoft.com/office/drawing/2016/5/11/chartex" xmlns:cx6="http://schemas.microsoft.com/office/drawing/2016/5/12/chartex" xmlns:cx7="http://schemas.microsoft.com/office/drawing/2016/5/13/chartex" xmlns:cx8="http://schemas.microsoft.com/office/drawing/2016/5/14/chartex" xmlns:mc="http://schemas.openxmlformats.org/markup-compatibility/2006" xmlns:aink="http://schemas.microsoft.com/office/drawing/2016/ink" xmlns:am3d="http://schemas.microsoft.com/office/drawing/2017/model3d" xmlns:o="urn:schemas-microsoft-com:office:office" xmlns:oel="http://schemas.microsoft.com/office/2019/extlst" xmlns:r="http://schemas.openxmlformats.org/officeDocument/2006/relationships" xmlns:m="http://schemas.openxmlformats.org/officeDocument/2006/math" xmlns:v="urn:schemas-microsoft-com:vml" xmlns:wp14="http://schemas.microsoft.com/office/word/2010/wordprocessingDrawing" xmlns:wp="http://schemas.openxmlformats.org/drawingml/2006/wordprocessingDrawing" xmlns:w10="urn:schemas-microsoft-com:office:word" xmlns:w="http://schemas.openxmlformats.org/wordprocessingml/2006/main" xmlns:w14="http://schemas.microsoft.com/office/word/2010/wordml" xmlns:w15="http://schemas.microsoft.com/office/word/2012/wordml" xmlns:w16cex="http://schemas.microsoft.com/office/word/2018/wordml/cex" xmlns:w16cid="http://schemas.microsoft.com/office/word/2016/wordml/cid" xmlns:w16="http://schemas.microsoft.com/office/word/2018/wordml" xmlns:w16du="http://schemas.microsoft.com/office/word/2023/wordml/word16du" xmlns:w16sdtdh="http://schemas.microsoft.com/office/word/2020/wordml/sdtdatahash" xmlns:w16sdtfl="http://schemas.microsoft.com/office/word/2024/wordml/sdtformatlock" xmlns:w16se="http://schemas.microsoft.com/office/word/2015/wordml/symex" xmlns:wpg="http://schemas.microsoft.com/office/word/2010/wordprocessingGroup" xmlns:wpi="http://schemas.microsoft.com/office/word/2010/wordprocessingInk" xmlns:wne="http://schemas.microsoft.com/office/word/2006/wordml" xmlns:wps="http://schemas.microsoft.com/office/word/2010/wordprocessingShape" mc:Ignorable="w14 w15 w16se w16cid w16 w16cex w16sdtdh w16sdtfl w16du wp14">
   <w:sdt>
     <w:sdtPr>
       <w:id w:val="-937982979"/>
@@ -1306,7 +1265,6 @@
         <w:docPartUnique/>
       </w:docPartObj>
     </w:sdtPr>
-    <w:sdtEndPr/>
     <w:sdtContent>
       <w:p>
         <w:pPr>
@@ -1518,7 +1476,7 @@
             </mc:Choice>
             <mc:Fallback>
               <w:pict>
-                <v:group w14:anchorId="51D00065" id="Grupo 32" o:spid="_x0000_s1026" style="position:absolute;margin-left:0;margin-top:0;width:610.5pt;height:15pt;z-index:251659264;mso-width-percent:1000;mso-position-horizontal:center;mso-position-horizontal-relative:page;mso-position-vertical:center;mso-position-vertical-relative:bottom-margin-area;mso-width-percent:1000" coordorigin=",14970" coordsize="12255,300" o:gfxdata="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">
+                <v:group w14:anchorId="51D00065" id="Grupo 32" o:spid="_x0000_s1026" style="position:absolute;margin-left:0;margin-top:0;width:610.5pt;height:15pt;z-index:251659264;mso-width-percent:1000;mso-position-horizontal:center;mso-position-horizontal-relative:page;mso-position-vertical:center;mso-position-vertical-relative:bottom-margin-area;mso-width-percent:1000" coordorigin=",14970" coordsize="12255,300" o:gfxdata="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">
                   <v:shapetype id="_x0000_t202" coordsize="21600,21600" o:spt="202" path="m,l,21600r21600,l21600,xe">
                     <v:stroke joinstyle="miter"/>
                     <v:path gradientshapeok="t" o:connecttype="rect"/>
@@ -1585,7 +1543,7 @@
 </file>
 
 <file path=word/footnotes.xml><?xml version="1.0" encoding="utf-8"?>
-<w:footnotes xmlns:wpc="http://schemas.microsoft.com/office/word/2010/wordprocessingCanvas" xmlns:cx="http://schemas.microsoft.com/office/drawing/2014/chartex" xmlns:mc="http://schemas.openxmlformats.org/markup-compatibility/2006" xmlns:o="urn:schemas-microsoft-com:office:office" xmlns:r="http://schemas.openxmlformats.org/officeDocument/2006/relationships" xmlns:m="http://schemas.openxmlformats.org/officeDocument/2006/math" xmlns:v="urn:schemas-microsoft-com:vml" xmlns:wp14="http://schemas.microsoft.com/office/word/2010/wordprocessingDrawing" xmlns:wp="http://schemas.openxmlformats.org/drawingml/2006/wordprocessingDrawing" xmlns:w10="urn:schemas-microsoft-com:office:word" xmlns:w="http://schemas.openxmlformats.org/wordprocessingml/2006/main" xmlns:w14="http://schemas.microsoft.com/office/word/2010/wordml" xmlns:w15="http://schemas.microsoft.com/office/word/2012/wordml" xmlns:w16se="http://schemas.microsoft.com/office/word/2015/wordml/symex" xmlns:wpg="http://schemas.microsoft.com/office/word/2010/wordprocessingGroup" xmlns:wpi="http://schemas.microsoft.com/office/word/2010/wordprocessingInk" xmlns:wne="http://schemas.microsoft.com/office/word/2006/wordml" xmlns:wps="http://schemas.microsoft.com/office/word/2010/wordprocessingShape" mc:Ignorable="w14 w15 w16se wp14">
+<w:footnotes xmlns:wpc="http://schemas.microsoft.com/office/word/2010/wordprocessingCanvas" xmlns:cx="http://schemas.microsoft.com/office/drawing/2014/chartex" xmlns:cx1="http://schemas.microsoft.com/office/drawing/2015/9/8/chartex" xmlns:cx2="http://schemas.microsoft.com/office/drawing/2015/10/21/chartex" xmlns:cx3="http://schemas.microsoft.com/office/drawing/2016/5/9/chartex" xmlns:cx4="http://schemas.microsoft.com/office/drawing/2016/5/10/chartex" xmlns:cx5="http://schemas.microsoft.com/office/drawing/2016/5/11/chartex" xmlns:cx6="http://schemas.microsoft.com/office/drawing/2016/5/12/chartex" xmlns:cx7="http://schemas.microsoft.com/office/drawing/2016/5/13/chartex" xmlns:cx8="http://schemas.microsoft.com/office/drawing/2016/5/14/chartex" xmlns:mc="http://schemas.openxmlformats.org/markup-compatibility/2006" xmlns:aink="http://schemas.microsoft.com/office/drawing/2016/ink" xmlns:am3d="http://schemas.microsoft.com/office/drawing/2017/model3d" xmlns:o="urn:schemas-microsoft-com:office:office" xmlns:oel="http://schemas.microsoft.com/office/2019/extlst" xmlns:r="http://schemas.openxmlformats.org/officeDocument/2006/relationships" xmlns:m="http://schemas.openxmlformats.org/officeDocument/2006/math" xmlns:v="urn:schemas-microsoft-com:vml" xmlns:wp14="http://schemas.microsoft.com/office/word/2010/wordprocessingDrawing" xmlns:wp="http://schemas.openxmlformats.org/drawingml/2006/wordprocessingDrawing" xmlns:w10="urn:schemas-microsoft-com:office:word" xmlns:w="http://schemas.openxmlformats.org/wordprocessingml/2006/main" xmlns:w14="http://schemas.microsoft.com/office/word/2010/wordml" xmlns:w15="http://schemas.microsoft.com/office/word/2012/wordml" xmlns:w16cex="http://schemas.microsoft.com/office/word/2018/wordml/cex" xmlns:w16cid="http://schemas.microsoft.com/office/word/2016/wordml/cid" xmlns:w16="http://schemas.microsoft.com/office/word/2018/wordml" xmlns:w16du="http://schemas.microsoft.com/office/word/2023/wordml/word16du" xmlns:w16sdtdh="http://schemas.microsoft.com/office/word/2020/wordml/sdtdatahash" xmlns:w16sdtfl="http://schemas.microsoft.com/office/word/2024/wordml/sdtformatlock" xmlns:w16se="http://schemas.microsoft.com/office/word/2015/wordml/symex" xmlns:wpg="http://schemas.microsoft.com/office/word/2010/wordprocessingGroup" xmlns:wpi="http://schemas.microsoft.com/office/word/2010/wordprocessingInk" xmlns:wne="http://schemas.microsoft.com/office/word/2006/wordml" xmlns:wps="http://schemas.microsoft.com/office/word/2010/wordprocessingShape" mc:Ignorable="w14 w15 w16se w16cid w16 w16cex w16sdtdh w16sdtfl w16du wp14">
   <w:footnote w:type="separator" w:id="-1">
     <w:p>
       <w:pPr>
@@ -1610,7 +1568,7 @@
 </file>
 
 <file path=word/header1.xml><?xml version="1.0" encoding="utf-8"?>
-<w:hdr xmlns:wpc="http://schemas.microsoft.com/office/word/2010/wordprocessingCanvas" xmlns:cx="http://schemas.microsoft.com/office/drawing/2014/chartex" xmlns:mc="http://schemas.openxmlformats.org/markup-compatibility/2006" xmlns:o="urn:schemas-microsoft-com:office:office" xmlns:r="http://schemas.openxmlformats.org/officeDocument/2006/relationships" xmlns:m="http://schemas.openxmlformats.org/officeDocument/2006/math" xmlns:v="urn:schemas-microsoft-com:vml" xmlns:wp14="http://schemas.microsoft.com/office/word/2010/wordprocessingDrawing" xmlns:wp="http://schemas.openxmlformats.org/drawingml/2006/wordprocessingDrawing" xmlns:w10="urn:schemas-microsoft-com:office:word" xmlns:w="http://schemas.openxmlformats.org/wordprocessingml/2006/main" xmlns:w14="http://schemas.microsoft.com/office/word/2010/wordml" xmlns:w15="http://schemas.microsoft.com/office/word/2012/wordml" xmlns:w16se="http://schemas.microsoft.com/office/word/2015/wordml/symex" xmlns:wpg="http://schemas.microsoft.com/office/word/2010/wordprocessingGroup" xmlns:wpi="http://schemas.microsoft.com/office/word/2010/wordprocessingInk" xmlns:wne="http://schemas.microsoft.com/office/word/2006/wordml" xmlns:wps="http://schemas.microsoft.com/office/word/2010/wordprocessingShape" mc:Ignorable="w14 w15 w16se wp14">
+<w:hdr xmlns:wpc="http://schemas.microsoft.com/office/word/2010/wordprocessingCanvas" xmlns:cx="http://schemas.microsoft.com/office/drawing/2014/chartex" xmlns:cx1="http://schemas.microsoft.com/office/drawing/2015/9/8/chartex" xmlns:cx2="http://schemas.microsoft.com/office/drawing/2015/10/21/chartex" xmlns:cx3="http://schemas.microsoft.com/office/drawing/2016/5/9/chartex" xmlns:cx4="http://schemas.microsoft.com/office/drawing/2016/5/10/chartex" xmlns:cx5="http://schemas.microsoft.com/office/drawing/2016/5/11/chartex" xmlns:cx6="http://schemas.microsoft.com/office/drawing/2016/5/12/chartex" xmlns:cx7="http://schemas.microsoft.com/office/drawing/2016/5/13/chartex" xmlns:cx8="http://schemas.microsoft.com/office/drawing/2016/5/14/chartex" xmlns:mc="http://schemas.openxmlformats.org/markup-compatibility/2006" xmlns:aink="http://schemas.microsoft.com/office/drawing/2016/ink" xmlns:am3d="http://schemas.microsoft.com/office/drawing/2017/model3d" xmlns:o="urn:schemas-microsoft-com:office:office" xmlns:oel="http://schemas.microsoft.com/office/2019/extlst" xmlns:r="http://schemas.openxmlformats.org/officeDocument/2006/relationships" xmlns:m="http://schemas.openxmlformats.org/officeDocument/2006/math" xmlns:v="urn:schemas-microsoft-com:vml" xmlns:wp14="http://schemas.microsoft.com/office/word/2010/wordprocessingDrawing" xmlns:wp="http://schemas.openxmlformats.org/drawingml/2006/wordprocessingDrawing" xmlns:w10="urn:schemas-microsoft-com:office:word" xmlns:w="http://schemas.openxmlformats.org/wordprocessingml/2006/main" xmlns:w14="http://schemas.microsoft.com/office/word/2010/wordml" xmlns:w15="http://schemas.microsoft.com/office/word/2012/wordml" xmlns:w16cex="http://schemas.microsoft.com/office/word/2018/wordml/cex" xmlns:w16cid="http://schemas.microsoft.com/office/word/2016/wordml/cid" xmlns:w16="http://schemas.microsoft.com/office/word/2018/wordml" xmlns:w16du="http://schemas.microsoft.com/office/word/2023/wordml/word16du" xmlns:w16sdtdh="http://schemas.microsoft.com/office/word/2020/wordml/sdtdatahash" xmlns:w16sdtfl="http://schemas.microsoft.com/office/word/2024/wordml/sdtformatlock" xmlns:w16se="http://schemas.microsoft.com/office/word/2015/wordml/symex" xmlns:wpg="http://schemas.microsoft.com/office/word/2010/wordprocessingGroup" xmlns:wpi="http://schemas.microsoft.com/office/word/2010/wordprocessingInk" xmlns:wne="http://schemas.microsoft.com/office/word/2006/wordml" xmlns:wps="http://schemas.microsoft.com/office/word/2010/wordprocessingShape" mc:Ignorable="w14 w15 w16se w16cid w16 w16cex w16sdtdh w16sdtfl w16du wp14">
   <w:tbl>
     <w:tblPr>
       <w:tblStyle w:val="Tablaconcuadrcula"/>
@@ -1790,7 +1748,7 @@
 </file>
 
 <file path=word/header2.xml><?xml version="1.0" encoding="utf-8"?>
-<w:hdr xmlns:wpc="http://schemas.microsoft.com/office/word/2010/wordprocessingCanvas" xmlns:cx="http://schemas.microsoft.com/office/drawing/2014/chartex" xmlns:mc="http://schemas.openxmlformats.org/markup-compatibility/2006" xmlns:o="urn:schemas-microsoft-com:office:office" xmlns:r="http://schemas.openxmlformats.org/officeDocument/2006/relationships" xmlns:m="http://schemas.openxmlformats.org/officeDocument/2006/math" xmlns:v="urn:schemas-microsoft-com:vml" xmlns:wp14="http://schemas.microsoft.com/office/word/2010/wordprocessingDrawing" xmlns:wp="http://schemas.openxmlformats.org/drawingml/2006/wordprocessingDrawing" xmlns:w10="urn:schemas-microsoft-com:office:word" xmlns:w="http://schemas.openxmlformats.org/wordprocessingml/2006/main" xmlns:w14="http://schemas.microsoft.com/office/word/2010/wordml" xmlns:w15="http://schemas.microsoft.com/office/word/2012/wordml" xmlns:w16se="http://schemas.microsoft.com/office/word/2015/wordml/symex" xmlns:wpg="http://schemas.microsoft.com/office/word/2010/wordprocessingGroup" xmlns:wpi="http://schemas.microsoft.com/office/word/2010/wordprocessingInk" xmlns:wne="http://schemas.microsoft.com/office/word/2006/wordml" xmlns:wps="http://schemas.microsoft.com/office/word/2010/wordprocessingShape" mc:Ignorable="w14 w15 w16se wp14">
+<w:hdr xmlns:wpc="http://schemas.microsoft.com/office/word/2010/wordprocessingCanvas" xmlns:cx="http://schemas.microsoft.com/office/drawing/2014/chartex" xmlns:cx1="http://schemas.microsoft.com/office/drawing/2015/9/8/chartex" xmlns:cx2="http://schemas.microsoft.com/office/drawing/2015/10/21/chartex" xmlns:cx3="http://schemas.microsoft.com/office/drawing/2016/5/9/chartex" xmlns:cx4="http://schemas.microsoft.com/office/drawing/2016/5/10/chartex" xmlns:cx5="http://schemas.microsoft.com/office/drawing/2016/5/11/chartex" xmlns:cx6="http://schemas.microsoft.com/office/drawing/2016/5/12/chartex" xmlns:cx7="http://schemas.microsoft.com/office/drawing/2016/5/13/chartex" xmlns:cx8="http://schemas.microsoft.com/office/drawing/2016/5/14/chartex" xmlns:mc="http://schemas.openxmlformats.org/markup-compatibility/2006" xmlns:aink="http://schemas.microsoft.com/office/drawing/2016/ink" xmlns:am3d="http://schemas.microsoft.com/office/drawing/2017/model3d" xmlns:o="urn:schemas-microsoft-com:office:office" xmlns:oel="http://schemas.microsoft.com/office/2019/extlst" xmlns:r="http://schemas.openxmlformats.org/officeDocument/2006/relationships" xmlns:m="http://schemas.openxmlformats.org/officeDocument/2006/math" xmlns:v="urn:schemas-microsoft-com:vml" xmlns:wp14="http://schemas.microsoft.com/office/word/2010/wordprocessingDrawing" xmlns:wp="http://schemas.openxmlformats.org/drawingml/2006/wordprocessingDrawing" xmlns:w10="urn:schemas-microsoft-com:office:word" xmlns:w="http://schemas.openxmlformats.org/wordprocessingml/2006/main" xmlns:w14="http://schemas.microsoft.com/office/word/2010/wordml" xmlns:w15="http://schemas.microsoft.com/office/word/2012/wordml" xmlns:w16cex="http://schemas.microsoft.com/office/word/2018/wordml/cex" xmlns:w16cid="http://schemas.microsoft.com/office/word/2016/wordml/cid" xmlns:w16="http://schemas.microsoft.com/office/word/2018/wordml" xmlns:w16du="http://schemas.microsoft.com/office/word/2023/wordml/word16du" xmlns:w16sdtdh="http://schemas.microsoft.com/office/word/2020/wordml/sdtdatahash" xmlns:w16sdtfl="http://schemas.microsoft.com/office/word/2024/wordml/sdtformatlock" xmlns:w16se="http://schemas.microsoft.com/office/word/2015/wordml/symex" xmlns:wpg="http://schemas.microsoft.com/office/word/2010/wordprocessingGroup" xmlns:wpi="http://schemas.microsoft.com/office/word/2010/wordprocessingInk" xmlns:wne="http://schemas.microsoft.com/office/word/2006/wordml" xmlns:wps="http://schemas.microsoft.com/office/word/2010/wordprocessingShape" mc:Ignorable="w14 w15 w16se w16cid w16 w16cex w16sdtdh w16sdtfl w16du wp14">
   <w:tbl>
     <w:tblPr>
       <w:tblStyle w:val="Tablaconcuadrcula"/>
@@ -2065,7 +2023,7 @@
 </file>
 
 <file path=word/numbering.xml><?xml version="1.0" encoding="utf-8"?>
-<w:numbering xmlns:wpc="http://schemas.microsoft.com/office/word/2010/wordprocessingCanvas" xmlns:cx="http://schemas.microsoft.com/office/drawing/2014/chartex" xmlns:mc="http://schemas.openxmlformats.org/markup-compatibility/2006" xmlns:o="urn:schemas-microsoft-com:office:office" xmlns:r="http://schemas.openxmlformats.org/officeDocument/2006/relationships" xmlns:m="http://schemas.openxmlformats.org/officeDocument/2006/math" xmlns:v="urn:schemas-microsoft-com:vml" xmlns:wp14="http://schemas.microsoft.com/office/word/2010/wordprocessingDrawing" xmlns:wp="http://schemas.openxmlformats.org/drawingml/2006/wordprocessingDrawing" xmlns:w10="urn:schemas-microsoft-com:office:word" xmlns:w="http://schemas.openxmlformats.org/wordprocessingml/2006/main" xmlns:w14="http://schemas.microsoft.com/office/word/2010/wordml" xmlns:w15="http://schemas.microsoft.com/office/word/2012/wordml" xmlns:w16se="http://schemas.microsoft.com/office/word/2015/wordml/symex" xmlns:wpg="http://schemas.microsoft.com/office/word/2010/wordprocessingGroup" xmlns:wpi="http://schemas.microsoft.com/office/word/2010/wordprocessingInk" xmlns:wne="http://schemas.microsoft.com/office/word/2006/wordml" xmlns:wps="http://schemas.microsoft.com/office/word/2010/wordprocessingShape" mc:Ignorable="w14 w15 w16se wp14">
+<w:numbering xmlns:wpc="http://schemas.microsoft.com/office/word/2010/wordprocessingCanvas" xmlns:cx="http://schemas.microsoft.com/office/drawing/2014/chartex" xmlns:cx1="http://schemas.microsoft.com/office/drawing/2015/9/8/chartex" xmlns:cx2="http://schemas.microsoft.com/office/drawing/2015/10/21/chartex" xmlns:cx3="http://schemas.microsoft.com/office/drawing/2016/5/9/chartex" xmlns:cx4="http://schemas.microsoft.com/office/drawing/2016/5/10/chartex" xmlns:cx5="http://schemas.microsoft.com/office/drawing/2016/5/11/chartex" xmlns:cx6="http://schemas.microsoft.com/office/drawing/2016/5/12/chartex" xmlns:cx7="http://schemas.microsoft.com/office/drawing/2016/5/13/chartex" xmlns:cx8="http://schemas.microsoft.com/office/drawing/2016/5/14/chartex" xmlns:mc="http://schemas.openxmlformats.org/markup-compatibility/2006" xmlns:aink="http://schemas.microsoft.com/office/drawing/2016/ink" xmlns:am3d="http://schemas.microsoft.com/office/drawing/2017/model3d" xmlns:o="urn:schemas-microsoft-com:office:office" xmlns:oel="http://schemas.microsoft.com/office/2019/extlst" xmlns:r="http://schemas.openxmlformats.org/officeDocument/2006/relationships" xmlns:m="http://schemas.openxmlformats.org/officeDocument/2006/math" xmlns:v="urn:schemas-microsoft-com:vml" xmlns:wp14="http://schemas.microsoft.com/office/word/2010/wordprocessingDrawing" xmlns:wp="http://schemas.openxmlformats.org/drawingml/2006/wordprocessingDrawing" xmlns:w10="urn:schemas-microsoft-com:office:word" xmlns:w="http://schemas.openxmlformats.org/wordprocessingml/2006/main" xmlns:w14="http://schemas.microsoft.com/office/word/2010/wordml" xmlns:w15="http://schemas.microsoft.com/office/word/2012/wordml" xmlns:w16cex="http://schemas.microsoft.com/office/word/2018/wordml/cex" xmlns:w16cid="http://schemas.microsoft.com/office/word/2016/wordml/cid" xmlns:w16="http://schemas.microsoft.com/office/word/2018/wordml" xmlns:w16du="http://schemas.microsoft.com/office/word/2023/wordml/word16du" xmlns:w16sdtdh="http://schemas.microsoft.com/office/word/2020/wordml/sdtdatahash" xmlns:w16sdtfl="http://schemas.microsoft.com/office/word/2024/wordml/sdtformatlock" xmlns:w16se="http://schemas.microsoft.com/office/word/2015/wordml/symex" xmlns:wpg="http://schemas.microsoft.com/office/word/2010/wordprocessingGroup" xmlns:wpi="http://schemas.microsoft.com/office/word/2010/wordprocessingInk" xmlns:wne="http://schemas.microsoft.com/office/word/2006/wordml" xmlns:wps="http://schemas.microsoft.com/office/word/2010/wordprocessingShape" mc:Ignorable="w14 w15 w16se w16cid w16 w16cex w16sdtdh w16sdtfl w16du wp14">
   <w:abstractNum w:abstractNumId="0" w15:restartNumberingAfterBreak="0">
     <w:nsid w:val="049156A1"/>
     <w:multiLevelType w:val="hybridMultilevel"/>
@@ -6639,124 +6597,124 @@
       </w:rPr>
     </w:lvl>
   </w:abstractNum>
-  <w:num w:numId="1">
+  <w:num w:numId="1" w16cid:durableId="337193002">
     <w:abstractNumId w:val="3"/>
   </w:num>
-  <w:num w:numId="2">
+  <w:num w:numId="2" w16cid:durableId="1434858672">
     <w:abstractNumId w:val="8"/>
   </w:num>
-  <w:num w:numId="3">
+  <w:num w:numId="3" w16cid:durableId="5600267">
     <w:abstractNumId w:val="12"/>
   </w:num>
-  <w:num w:numId="4">
+  <w:num w:numId="4" w16cid:durableId="456218093">
     <w:abstractNumId w:val="28"/>
   </w:num>
-  <w:num w:numId="5">
+  <w:num w:numId="5" w16cid:durableId="1752044826">
     <w:abstractNumId w:val="30"/>
   </w:num>
-  <w:num w:numId="6">
+  <w:num w:numId="6" w16cid:durableId="222062724">
     <w:abstractNumId w:val="4"/>
   </w:num>
-  <w:num w:numId="7">
+  <w:num w:numId="7" w16cid:durableId="694037743">
     <w:abstractNumId w:val="11"/>
   </w:num>
-  <w:num w:numId="8">
+  <w:num w:numId="8" w16cid:durableId="92871200">
     <w:abstractNumId w:val="19"/>
   </w:num>
-  <w:num w:numId="9">
+  <w:num w:numId="9" w16cid:durableId="790705415">
     <w:abstractNumId w:val="15"/>
   </w:num>
-  <w:num w:numId="10">
+  <w:num w:numId="10" w16cid:durableId="486289875">
     <w:abstractNumId w:val="9"/>
   </w:num>
-  <w:num w:numId="11">
+  <w:num w:numId="11" w16cid:durableId="339355818">
     <w:abstractNumId w:val="24"/>
   </w:num>
-  <w:num w:numId="12">
+  <w:num w:numId="12" w16cid:durableId="1859460955">
     <w:abstractNumId w:val="35"/>
   </w:num>
-  <w:num w:numId="13">
+  <w:num w:numId="13" w16cid:durableId="1526216160">
     <w:abstractNumId w:val="29"/>
   </w:num>
-  <w:num w:numId="14">
+  <w:num w:numId="14" w16cid:durableId="636573480">
     <w:abstractNumId w:val="1"/>
   </w:num>
-  <w:num w:numId="15">
+  <w:num w:numId="15" w16cid:durableId="1621690717">
     <w:abstractNumId w:val="36"/>
   </w:num>
-  <w:num w:numId="16">
+  <w:num w:numId="16" w16cid:durableId="1883856382">
     <w:abstractNumId w:val="21"/>
   </w:num>
-  <w:num w:numId="17">
+  <w:num w:numId="17" w16cid:durableId="493035402">
     <w:abstractNumId w:val="17"/>
   </w:num>
-  <w:num w:numId="18">
+  <w:num w:numId="18" w16cid:durableId="1143156619">
     <w:abstractNumId w:val="31"/>
   </w:num>
-  <w:num w:numId="19">
+  <w:num w:numId="19" w16cid:durableId="1823958551">
     <w:abstractNumId w:val="10"/>
   </w:num>
-  <w:num w:numId="20">
+  <w:num w:numId="20" w16cid:durableId="1411658558">
     <w:abstractNumId w:val="39"/>
   </w:num>
-  <w:num w:numId="21">
+  <w:num w:numId="21" w16cid:durableId="1588660149">
     <w:abstractNumId w:val="34"/>
   </w:num>
-  <w:num w:numId="22">
+  <w:num w:numId="22" w16cid:durableId="487601549">
     <w:abstractNumId w:val="13"/>
   </w:num>
-  <w:num w:numId="23">
+  <w:num w:numId="23" w16cid:durableId="2120296252">
     <w:abstractNumId w:val="14"/>
   </w:num>
-  <w:num w:numId="24">
+  <w:num w:numId="24" w16cid:durableId="355931316">
     <w:abstractNumId w:val="5"/>
   </w:num>
-  <w:num w:numId="25">
+  <w:num w:numId="25" w16cid:durableId="516116790">
     <w:abstractNumId w:val="16"/>
   </w:num>
-  <w:num w:numId="26">
+  <w:num w:numId="26" w16cid:durableId="2053655196">
     <w:abstractNumId w:val="20"/>
   </w:num>
-  <w:num w:numId="27">
+  <w:num w:numId="27" w16cid:durableId="257099135">
     <w:abstractNumId w:val="23"/>
   </w:num>
-  <w:num w:numId="28">
+  <w:num w:numId="28" w16cid:durableId="576979000">
     <w:abstractNumId w:val="0"/>
   </w:num>
-  <w:num w:numId="29">
+  <w:num w:numId="29" w16cid:durableId="126902257">
     <w:abstractNumId w:val="18"/>
   </w:num>
-  <w:num w:numId="30">
+  <w:num w:numId="30" w16cid:durableId="560673854">
     <w:abstractNumId w:val="22"/>
   </w:num>
-  <w:num w:numId="31">
+  <w:num w:numId="31" w16cid:durableId="812256156">
     <w:abstractNumId w:val="2"/>
   </w:num>
-  <w:num w:numId="32">
+  <w:num w:numId="32" w16cid:durableId="955259549">
     <w:abstractNumId w:val="7"/>
   </w:num>
-  <w:num w:numId="33">
+  <w:num w:numId="33" w16cid:durableId="489446831">
     <w:abstractNumId w:val="32"/>
   </w:num>
-  <w:num w:numId="34">
+  <w:num w:numId="34" w16cid:durableId="589899467">
     <w:abstractNumId w:val="38"/>
   </w:num>
-  <w:num w:numId="35">
+  <w:num w:numId="35" w16cid:durableId="1296789371">
     <w:abstractNumId w:val="6"/>
   </w:num>
-  <w:num w:numId="36">
+  <w:num w:numId="36" w16cid:durableId="1354109152">
     <w:abstractNumId w:val="25"/>
   </w:num>
-  <w:num w:numId="37">
+  <w:num w:numId="37" w16cid:durableId="1132476481">
     <w:abstractNumId w:val="37"/>
   </w:num>
-  <w:num w:numId="38">
+  <w:num w:numId="38" w16cid:durableId="1393230526">
     <w:abstractNumId w:val="27"/>
   </w:num>
-  <w:num w:numId="39">
+  <w:num w:numId="39" w16cid:durableId="1673027948">
     <w:abstractNumId w:val="26"/>
   </w:num>
-  <w:num w:numId="40">
+  <w:num w:numId="40" w16cid:durableId="1631670482">
     <w:abstractNumId w:val="33"/>
   </w:num>
   <w:numIdMacAtCleanup w:val="18"/>
@@ -6764,7 +6722,7 @@
 </file>
 
 <file path=word/styles.xml><?xml version="1.0" encoding="utf-8"?>
-<w:styles xmlns:mc="http://schemas.openxmlformats.org/markup-compatibility/2006" xmlns:r="http://schemas.openxmlformats.org/officeDocument/2006/relationships" xmlns:w="http://schemas.openxmlformats.org/wordprocessingml/2006/main" xmlns:w14="http://schemas.microsoft.com/office/word/2010/wordml" xmlns:w15="http://schemas.microsoft.com/office/word/2012/wordml" xmlns:w16se="http://schemas.microsoft.com/office/word/2015/wordml/symex" mc:Ignorable="w14 w15 w16se">
+<w:styles xmlns:mc="http://schemas.openxmlformats.org/markup-compatibility/2006" xmlns:r="http://schemas.openxmlformats.org/officeDocument/2006/relationships" xmlns:w="http://schemas.openxmlformats.org/wordprocessingml/2006/main" xmlns:w14="http://schemas.microsoft.com/office/word/2010/wordml" xmlns:w15="http://schemas.microsoft.com/office/word/2012/wordml" xmlns:w16cex="http://schemas.microsoft.com/office/word/2018/wordml/cex" xmlns:w16cid="http://schemas.microsoft.com/office/word/2016/wordml/cid" xmlns:w16="http://schemas.microsoft.com/office/word/2018/wordml" xmlns:w16du="http://schemas.microsoft.com/office/word/2023/wordml/word16du" xmlns:w16sdtdh="http://schemas.microsoft.com/office/word/2020/wordml/sdtdatahash" xmlns:w16sdtfl="http://schemas.microsoft.com/office/word/2024/wordml/sdtformatlock" xmlns:w16se="http://schemas.microsoft.com/office/word/2015/wordml/symex" mc:Ignorable="w14 w15 w16se w16cid w16 w16cex w16sdtdh w16sdtfl w16du">
   <w:docDefaults>
     <w:rPrDefault>
       <w:rPr>
@@ -6780,7 +6738,7 @@
       </w:pPr>
     </w:pPrDefault>
   </w:docDefaults>
-  <w:latentStyles w:defLockedState="0" w:defUIPriority="99" w:defSemiHidden="0" w:defUnhideWhenUsed="0" w:defQFormat="0" w:count="371">
+  <w:latentStyles w:defLockedState="0" w:defUIPriority="99" w:defSemiHidden="0" w:defUnhideWhenUsed="0" w:defQFormat="0" w:count="376">
     <w:lsdException w:name="Normal" w:uiPriority="0" w:qFormat="1"/>
     <w:lsdException w:name="heading 1" w:uiPriority="9" w:qFormat="1"/>
     <w:lsdException w:name="heading 2" w:semiHidden="1" w:uiPriority="9" w:unhideWhenUsed="1" w:qFormat="1"/>
@@ -7152,6 +7110,11 @@
     <w:lsdException w:name="List Table 5 Dark Accent 6" w:uiPriority="50"/>
     <w:lsdException w:name="List Table 6 Colorful Accent 6" w:uiPriority="51"/>
     <w:lsdException w:name="List Table 7 Colorful Accent 6" w:uiPriority="52"/>
+    <w:lsdException w:name="Mention" w:semiHidden="1" w:unhideWhenUsed="1"/>
+    <w:lsdException w:name="Smart Hyperlink" w:semiHidden="1" w:unhideWhenUsed="1"/>
+    <w:lsdException w:name="Hashtag" w:semiHidden="1" w:unhideWhenUsed="1"/>
+    <w:lsdException w:name="Unresolved Mention" w:semiHidden="1" w:unhideWhenUsed="1"/>
+    <w:lsdException w:name="Smart Link" w:semiHidden="1" w:unhideWhenUsed="1"/>
   </w:latentStyles>
   <w:style w:type="paragraph" w:default="1" w:styleId="Normal">
     <w:name w:val="Normal"/>
@@ -7225,7 +7188,6 @@
   <w:style w:type="character" w:default="1" w:styleId="Fuentedeprrafopredeter">
     <w:name w:val="Default Paragraph Font"/>
     <w:uiPriority w:val="1"/>
-    <w:semiHidden/>
     <w:unhideWhenUsed/>
   </w:style>
   <w:style w:type="table" w:default="1" w:styleId="Tablanormal">
@@ -8135,7 +8097,7 @@
       <w:szCs w:val="24"/>
     </w:rPr>
   </w:style>
-  <w:style w:type="table" w:styleId="Cuadrculadetablaclara">
+  <w:style w:type="table" w:styleId="Tablaconcuadrculaclara">
     <w:name w:val="Grid Table Light"/>
     <w:basedOn w:val="Tablanormal"/>
     <w:uiPriority w:val="40"/>
@@ -8157,7 +8119,7 @@
   <w:style w:type="table" w:customStyle="1" w:styleId="Cuadrculadetablaclara1">
     <w:name w:val="Cuadrícula de tabla clara1"/>
     <w:basedOn w:val="Tablanormal"/>
-    <w:next w:val="Cuadrculadetablaclara"/>
+    <w:next w:val="Tablaconcuadrculaclara"/>
     <w:uiPriority w:val="40"/>
     <w:rsid w:val="00943DF1"/>
     <w:pPr>
@@ -8198,7 +8160,7 @@
       <w:spacing w:after="0" w:line="240" w:lineRule="auto"/>
     </w:pPr>
   </w:style>
-  <w:style w:type="character" w:styleId="Textoennegrita">
+  <w:style w:type="character" w:styleId="Fuerte">
     <w:name w:val="Strong"/>
     <w:basedOn w:val="Fuentedeprrafopredeter"/>
     <w:uiPriority w:val="22"/>
@@ -8210,532 +8172,6 @@
     </w:rPr>
   </w:style>
 </w:styles>
-</file>
-
-<file path=word/glossary/document.xml><?xml version="1.0" encoding="utf-8"?>
-<w:glossaryDocument xmlns:wpc="http://schemas.microsoft.com/office/word/2010/wordprocessingCanvas" xmlns:cx="http://schemas.microsoft.com/office/drawing/2014/chartex" xmlns:mc="http://schemas.openxmlformats.org/markup-compatibility/2006" xmlns:o="urn:schemas-microsoft-com:office:office" xmlns:r="http://schemas.openxmlformats.org/officeDocument/2006/relationships" xmlns:m="http://schemas.openxmlformats.org/officeDocument/2006/math" xmlns:v="urn:schemas-microsoft-com:vml" xmlns:wp14="http://schemas.microsoft.com/office/word/2010/wordprocessingDrawing" xmlns:wp="http://schemas.openxmlformats.org/drawingml/2006/wordprocessingDrawing" xmlns:w10="urn:schemas-microsoft-com:office:word" xmlns:w="http://schemas.openxmlformats.org/wordprocessingml/2006/main" xmlns:w14="http://schemas.microsoft.com/office/word/2010/wordml" xmlns:w15="http://schemas.microsoft.com/office/word/2012/wordml" xmlns:w16se="http://schemas.microsoft.com/office/word/2015/wordml/symex" xmlns:wpg="http://schemas.microsoft.com/office/word/2010/wordprocessingGroup" xmlns:wpi="http://schemas.microsoft.com/office/word/2010/wordprocessingInk" xmlns:wne="http://schemas.microsoft.com/office/word/2006/wordml" xmlns:wps="http://schemas.microsoft.com/office/word/2010/wordprocessingShape" mc:Ignorable="w14 w15 w16se wp14"/>
-</file>
-
-<file path=word/glossary/fontTable.xml><?xml version="1.0" encoding="utf-8"?>
-<w:fonts xmlns:mc="http://schemas.openxmlformats.org/markup-compatibility/2006" xmlns:r="http://schemas.openxmlformats.org/officeDocument/2006/relationships" xmlns:w="http://schemas.openxmlformats.org/wordprocessingml/2006/main" xmlns:w14="http://schemas.microsoft.com/office/word/2010/wordml" xmlns:w15="http://schemas.microsoft.com/office/word/2012/wordml" xmlns:w16se="http://schemas.microsoft.com/office/word/2015/wordml/symex" mc:Ignorable="w14 w15 w16se">
-  <w:font w:name="Calibri">
-    <w:panose1 w:val="020F0502020204030204"/>
-    <w:charset w:val="00"/>
-    <w:family w:val="swiss"/>
-    <w:pitch w:val="variable"/>
-    <w:sig w:usb0="E4002EFF" w:usb1="C000247B" w:usb2="00000009" w:usb3="00000000" w:csb0="000001FF" w:csb1="00000000"/>
-  </w:font>
-  <w:font w:name="Times New Roman">
-    <w:panose1 w:val="02020603050405020304"/>
-    <w:charset w:val="00"/>
-    <w:family w:val="roman"/>
-    <w:pitch w:val="variable"/>
-    <w:sig w:usb0="E0002EFF" w:usb1="C000785B" w:usb2="00000009" w:usb3="00000000" w:csb0="000001FF" w:csb1="00000000"/>
-  </w:font>
-  <w:font w:name="Courier New">
-    <w:panose1 w:val="02070309020205020404"/>
-    <w:charset w:val="00"/>
-    <w:family w:val="modern"/>
-    <w:pitch w:val="fixed"/>
-    <w:sig w:usb0="E0002EFF" w:usb1="C0007843" w:usb2="00000009" w:usb3="00000000" w:csb0="000001FF" w:csb1="00000000"/>
-  </w:font>
-  <w:font w:name="Wingdings">
-    <w:panose1 w:val="05000000000000000000"/>
-    <w:charset w:val="02"/>
-    <w:family w:val="auto"/>
-    <w:pitch w:val="variable"/>
-    <w:sig w:usb0="00000000" w:usb1="10000000" w:usb2="00000000" w:usb3="00000000" w:csb0="80000000" w:csb1="00000000"/>
-  </w:font>
-  <w:font w:name="Symbol">
-    <w:panose1 w:val="05050102010706020507"/>
-    <w:charset w:val="02"/>
-    <w:family w:val="roman"/>
-    <w:pitch w:val="variable"/>
-    <w:sig w:usb0="00000000" w:usb1="10000000" w:usb2="00000000" w:usb3="00000000" w:csb0="80000000" w:csb1="00000000"/>
-  </w:font>
-  <w:font w:name="Calibri Light">
-    <w:panose1 w:val="020F0302020204030204"/>
-    <w:charset w:val="00"/>
-    <w:family w:val="swiss"/>
-    <w:pitch w:val="variable"/>
-    <w:sig w:usb0="E4002EFF" w:usb1="C000247B" w:usb2="00000009" w:usb3="00000000" w:csb0="000001FF" w:csb1="00000000"/>
-  </w:font>
-  <w:font w:name="Segoe UI">
-    <w:panose1 w:val="020B0502040204020203"/>
-    <w:charset w:val="00"/>
-    <w:family w:val="swiss"/>
-    <w:pitch w:val="variable"/>
-    <w:sig w:usb0="E4002EFF" w:usb1="C000E47F" w:usb2="00000009" w:usb3="00000000" w:csb0="000001FF" w:csb1="00000000"/>
-  </w:font>
-  <w:font w:name="Century Gothic">
-    <w:panose1 w:val="020B0502020202020204"/>
-    <w:charset w:val="00"/>
-    <w:family w:val="swiss"/>
-    <w:pitch w:val="variable"/>
-    <w:sig w:usb0="00000287" w:usb1="00000000" w:usb2="00000000" w:usb3="00000000" w:csb0="0000009F" w:csb1="00000000"/>
-  </w:font>
-</w:fonts>
-</file>
-
-<file path=word/glossary/settings.xml><?xml version="1.0" encoding="utf-8"?>
-<w:settings xmlns:mc="http://schemas.openxmlformats.org/markup-compatibility/2006" xmlns:o="urn:schemas-microsoft-com:office:office" xmlns:r="http://schemas.openxmlformats.org/officeDocument/2006/relationships" xmlns:m="http://schemas.openxmlformats.org/officeDocument/2006/math" xmlns:v="urn:schemas-microsoft-com:vml" xmlns:w10="urn:schemas-microsoft-com:office:word" xmlns:w="http://schemas.openxmlformats.org/wordprocessingml/2006/main" xmlns:w14="http://schemas.microsoft.com/office/word/2010/wordml" xmlns:w15="http://schemas.microsoft.com/office/word/2012/wordml" xmlns:w16se="http://schemas.microsoft.com/office/word/2015/wordml/symex" xmlns:sl="http://schemas.openxmlformats.org/schemaLibrary/2006/main" mc:Ignorable="w14 w15 w16se">
-  <w:defaultTabStop w:val="708"/>
-  <w:hyphenationZone w:val="425"/>
-  <w:characterSpacingControl w:val="doNotCompress"/>
-  <w:compat>
-    <w:useFELayout/>
-    <w:compatSetting w:name="compatibilityMode" w:uri="http://schemas.microsoft.com/office/word" w:val="12"/>
-  </w:compat>
-  <w:rsids>
-    <w:rsidRoot w:val="008F14D6"/>
-    <w:rsid w:val="008F14D6"/>
-  </w:rsids>
-  <m:mathPr>
-    <m:mathFont m:val="Cambria Math"/>
-    <m:brkBin m:val="before"/>
-    <m:brkBinSub m:val="--"/>
-    <m:smallFrac m:val="0"/>
-    <m:dispDef/>
-    <m:lMargin m:val="0"/>
-    <m:rMargin m:val="0"/>
-    <m:defJc m:val="centerGroup"/>
-    <m:wrapIndent m:val="1440"/>
-    <m:intLim m:val="subSup"/>
-    <m:naryLim m:val="undOvr"/>
-  </m:mathPr>
-  <w:themeFontLang w:val="es-CL"/>
-  <w:clrSchemeMapping w:bg1="light1" w:t1="dark1" w:bg2="light2" w:t2="dark2" w:accent1="accent1" w:accent2="accent2" w:accent3="accent3" w:accent4="accent4" w:accent5="accent5" w:accent6="accent6" w:hyperlink="hyperlink" w:followedHyperlink="followedHyperlink"/>
-  <w:decimalSymbol w:val=","/>
-  <w:listSeparator w:val=";"/>
-</w:settings>
-</file>
-
-<file path=word/glossary/styles.xml><?xml version="1.0" encoding="utf-8"?>
-<w:styles xmlns:mc="http://schemas.openxmlformats.org/markup-compatibility/2006" xmlns:r="http://schemas.openxmlformats.org/officeDocument/2006/relationships" xmlns:w="http://schemas.openxmlformats.org/wordprocessingml/2006/main" xmlns:w14="http://schemas.microsoft.com/office/word/2010/wordml" xmlns:w15="http://schemas.microsoft.com/office/word/2012/wordml" xmlns:w16se="http://schemas.microsoft.com/office/word/2015/wordml/symex" mc:Ignorable="w14 w15 w16se">
-  <w:docDefaults>
-    <w:rPrDefault>
-      <w:rPr>
-        <w:rFonts w:asciiTheme="minorHAnsi" w:eastAsiaTheme="minorEastAsia" w:hAnsiTheme="minorHAnsi" w:cstheme="minorBidi"/>
-        <w:sz w:val="22"/>
-        <w:szCs w:val="22"/>
-        <w:lang w:val="es-CL" w:eastAsia="es-CL" w:bidi="ar-SA"/>
-      </w:rPr>
-    </w:rPrDefault>
-    <w:pPrDefault>
-      <w:pPr>
-        <w:spacing w:after="160" w:line="259" w:lineRule="auto"/>
-      </w:pPr>
-    </w:pPrDefault>
-  </w:docDefaults>
-  <w:latentStyles w:defLockedState="0" w:defUIPriority="99" w:defSemiHidden="0" w:defUnhideWhenUsed="0" w:defQFormat="0" w:count="371">
-    <w:lsdException w:name="Normal" w:uiPriority="0" w:qFormat="1"/>
-    <w:lsdException w:name="heading 1" w:uiPriority="9" w:qFormat="1"/>
-    <w:lsdException w:name="heading 2" w:semiHidden="1" w:uiPriority="9" w:unhideWhenUsed="1" w:qFormat="1"/>
-    <w:lsdException w:name="heading 3" w:semiHidden="1" w:uiPriority="9" w:unhideWhenUsed="1" w:qFormat="1"/>
-    <w:lsdException w:name="heading 4" w:semiHidden="1" w:uiPriority="9" w:unhideWhenUsed="1" w:qFormat="1"/>
-    <w:lsdException w:name="heading 5" w:semiHidden="1" w:uiPriority="9" w:unhideWhenUsed="1" w:qFormat="1"/>
-    <w:lsdException w:name="heading 6" w:semiHidden="1" w:uiPriority="9" w:unhideWhenUsed="1" w:qFormat="1"/>
-    <w:lsdException w:name="heading 7" w:semiHidden="1" w:uiPriority="9" w:unhideWhenUsed="1" w:qFormat="1"/>
-    <w:lsdException w:name="heading 8" w:semiHidden="1" w:uiPriority="9" w:unhideWhenUsed="1" w:qFormat="1"/>
-    <w:lsdException w:name="heading 9" w:semiHidden="1" w:uiPriority="9" w:unhideWhenUsed="1" w:qFormat="1"/>
-    <w:lsdException w:name="index 1" w:semiHidden="1" w:unhideWhenUsed="1"/>
-    <w:lsdException w:name="index 2" w:semiHidden="1" w:unhideWhenUsed="1"/>
-    <w:lsdException w:name="index 3" w:semiHidden="1" w:unhideWhenUsed="1"/>
-    <w:lsdException w:name="index 4" w:semiHidden="1" w:unhideWhenUsed="1"/>
-    <w:lsdException w:name="index 5" w:semiHidden="1" w:unhideWhenUsed="1"/>
-    <w:lsdException w:name="index 6" w:semiHidden="1" w:unhideWhenUsed="1"/>
-    <w:lsdException w:name="index 7" w:semiHidden="1" w:unhideWhenUsed="1"/>
-    <w:lsdException w:name="index 8" w:semiHidden="1" w:unhideWhenUsed="1"/>
-    <w:lsdException w:name="index 9" w:semiHidden="1" w:unhideWhenUsed="1"/>
-    <w:lsdException w:name="toc 1" w:semiHidden="1" w:uiPriority="39" w:unhideWhenUsed="1"/>
-    <w:lsdException w:name="toc 2" w:semiHidden="1" w:uiPriority="39" w:unhideWhenUsed="1"/>
-    <w:lsdException w:name="toc 3" w:semiHidden="1" w:uiPriority="39" w:unhideWhenUsed="1"/>
-    <w:lsdException w:name="toc 4" w:semiHidden="1" w:uiPriority="39" w:unhideWhenUsed="1"/>
-    <w:lsdException w:name="toc 5" w:semiHidden="1" w:uiPriority="39" w:unhideWhenUsed="1"/>
-    <w:lsdException w:name="toc 6" w:semiHidden="1" w:uiPriority="39" w:unhideWhenUsed="1"/>
-    <w:lsdException w:name="toc 7" w:semiHidden="1" w:uiPriority="39" w:unhideWhenUsed="1"/>
-    <w:lsdException w:name="toc 8" w:semiHidden="1" w:uiPriority="39" w:unhideWhenUsed="1"/>
-    <w:lsdException w:name="toc 9" w:semiHidden="1" w:uiPriority="39" w:unhideWhenUsed="1"/>
-    <w:lsdException w:name="Normal Indent" w:semiHidden="1" w:unhideWhenUsed="1"/>
-    <w:lsdException w:name="footnote text" w:semiHidden="1" w:unhideWhenUsed="1"/>
-    <w:lsdException w:name="annotation text" w:semiHidden="1" w:unhideWhenUsed="1"/>
-    <w:lsdException w:name="header" w:semiHidden="1" w:unhideWhenUsed="1"/>
-    <w:lsdException w:name="footer" w:semiHidden="1" w:unhideWhenUsed="1"/>
-    <w:lsdException w:name="index heading" w:semiHidden="1" w:unhideWhenUsed="1"/>
-    <w:lsdException w:name="caption" w:semiHidden="1" w:uiPriority="35" w:unhideWhenUsed="1" w:qFormat="1"/>
-    <w:lsdException w:name="table of figures" w:semiHidden="1" w:unhideWhenUsed="1"/>
-    <w:lsdException w:name="envelope address" w:semiHidden="1" w:unhideWhenUsed="1"/>
-    <w:lsdException w:name="envelope return" w:semiHidden="1" w:unhideWhenUsed="1"/>
-    <w:lsdException w:name="footnote reference" w:semiHidden="1" w:unhideWhenUsed="1"/>
-    <w:lsdException w:name="annotation reference" w:semiHidden="1" w:unhideWhenUsed="1"/>
-    <w:lsdException w:name="line number" w:semiHidden="1" w:unhideWhenUsed="1"/>
-    <w:lsdException w:name="page number" w:semiHidden="1" w:unhideWhenUsed="1"/>
-    <w:lsdException w:name="endnote reference" w:semiHidden="1" w:unhideWhenUsed="1"/>
-    <w:lsdException w:name="endnote text" w:semiHidden="1" w:unhideWhenUsed="1"/>
-    <w:lsdException w:name="table of authorities" w:semiHidden="1" w:unhideWhenUsed="1"/>
-    <w:lsdException w:name="macro" w:semiHidden="1" w:unhideWhenUsed="1"/>
-    <w:lsdException w:name="toa heading" w:semiHidden="1" w:unhideWhenUsed="1"/>
-    <w:lsdException w:name="List" w:semiHidden="1" w:unhideWhenUsed="1"/>
-    <w:lsdException w:name="List Bullet" w:semiHidden="1" w:unhideWhenUsed="1"/>
-    <w:lsdException w:name="List Number" w:semiHidden="1" w:unhideWhenUsed="1"/>
-    <w:lsdException w:name="List 2" w:semiHidden="1" w:unhideWhenUsed="1"/>
-    <w:lsdException w:name="List 3" w:semiHidden="1" w:unhideWhenUsed="1"/>
-    <w:lsdException w:name="List 4" w:semiHidden="1" w:unhideWhenUsed="1"/>
-    <w:lsdException w:name="List 5" w:semiHidden="1" w:unhideWhenUsed="1"/>
-    <w:lsdException w:name="List Bullet 2" w:semiHidden="1" w:unhideWhenUsed="1"/>
-    <w:lsdException w:name="List Bullet 3" w:semiHidden="1" w:unhideWhenUsed="1"/>
-    <w:lsdException w:name="List Bullet 4" w:semiHidden="1" w:unhideWhenUsed="1"/>
-    <w:lsdException w:name="List Bullet 5" w:semiHidden="1" w:unhideWhenUsed="1"/>
-    <w:lsdException w:name="List Number 2" w:semiHidden="1" w:unhideWhenUsed="1"/>
-    <w:lsdException w:name="List Number 3" w:semiHidden="1" w:unhideWhenUsed="1"/>
-    <w:lsdException w:name="List Number 4" w:semiHidden="1" w:unhideWhenUsed="1"/>
-    <w:lsdException w:name="List Number 5" w:semiHidden="1" w:unhideWhenUsed="1"/>
-    <w:lsdException w:name="Title" w:uiPriority="10" w:qFormat="1"/>
-    <w:lsdException w:name="Closing" w:semiHidden="1" w:unhideWhenUsed="1"/>
-    <w:lsdException w:name="Signature" w:semiHidden="1" w:unhideWhenUsed="1"/>
-    <w:lsdException w:name="Default Paragraph Font" w:semiHidden="1" w:uiPriority="1" w:unhideWhenUsed="1"/>
-    <w:lsdException w:name="Body Text" w:semiHidden="1" w:unhideWhenUsed="1"/>
-    <w:lsdException w:name="Body Text Indent" w:semiHidden="1" w:unhideWhenUsed="1"/>
-    <w:lsdException w:name="List Continue" w:semiHidden="1" w:unhideWhenUsed="1"/>
-    <w:lsdException w:name="List Continue 2" w:semiHidden="1" w:unhideWhenUsed="1"/>
-    <w:lsdException w:name="List Continue 3" w:semiHidden="1" w:unhideWhenUsed="1"/>
-    <w:lsdException w:name="List Continue 4" w:semiHidden="1" w:unhideWhenUsed="1"/>
-    <w:lsdException w:name="List Continue 5" w:semiHidden="1" w:unhideWhenUsed="1"/>
-    <w:lsdException w:name="Message Header" w:semiHidden="1" w:unhideWhenUsed="1"/>
-    <w:lsdException w:name="Subtitle" w:uiPriority="11" w:qFormat="1"/>
-    <w:lsdException w:name="Salutation" w:semiHidden="1" w:unhideWhenUsed="1"/>
-    <w:lsdException w:name="Date" w:semiHidden="1" w:unhideWhenUsed="1"/>
-    <w:lsdException w:name="Body Text First Indent" w:semiHidden="1" w:unhideWhenUsed="1"/>
-    <w:lsdException w:name="Body Text First Indent 2" w:semiHidden="1" w:unhideWhenUsed="1"/>
-    <w:lsdException w:name="Note Heading" w:semiHidden="1" w:unhideWhenUsed="1"/>
-    <w:lsdException w:name="Body Text 2" w:semiHidden="1" w:unhideWhenUsed="1"/>
-    <w:lsdException w:name="Body Text 3" w:semiHidden="1" w:unhideWhenUsed="1"/>
-    <w:lsdException w:name="Body Text Indent 2" w:semiHidden="1" w:unhideWhenUsed="1"/>
-    <w:lsdException w:name="Body Text Indent 3" w:semiHidden="1" w:unhideWhenUsed="1"/>
-    <w:lsdException w:name="Block Text" w:semiHidden="1" w:unhideWhenUsed="1"/>
-    <w:lsdException w:name="Hyperlink" w:semiHidden="1" w:unhideWhenUsed="1"/>
-    <w:lsdException w:name="FollowedHyperlink" w:semiHidden="1" w:unhideWhenUsed="1"/>
-    <w:lsdException w:name="Strong" w:uiPriority="22" w:qFormat="1"/>
-    <w:lsdException w:name="Emphasis" w:uiPriority="20" w:qFormat="1"/>
-    <w:lsdException w:name="Document Map" w:semiHidden="1" w:unhideWhenUsed="1"/>
-    <w:lsdException w:name="Plain Text" w:semiHidden="1" w:unhideWhenUsed="1"/>
-    <w:lsdException w:name="E-mail Signature" w:semiHidden="1" w:unhideWhenUsed="1"/>
-    <w:lsdException w:name="HTML Top of Form" w:semiHidden="1" w:unhideWhenUsed="1"/>
-    <w:lsdException w:name="HTML Bottom of Form" w:semiHidden="1" w:unhideWhenUsed="1"/>
-    <w:lsdException w:name="Normal (Web)" w:semiHidden="1" w:unhideWhenUsed="1"/>
-    <w:lsdException w:name="HTML Acronym" w:semiHidden="1" w:unhideWhenUsed="1"/>
-    <w:lsdException w:name="HTML Address" w:semiHidden="1" w:unhideWhenUsed="1"/>
-    <w:lsdException w:name="HTML Cite" w:semiHidden="1" w:unhideWhenUsed="1"/>
-    <w:lsdException w:name="HTML Code" w:semiHidden="1" w:unhideWhenUsed="1"/>
-    <w:lsdException w:name="HTML Definition" w:semiHidden="1" w:unhideWhenUsed="1"/>
-    <w:lsdException w:name="HTML Keyboard" w:semiHidden="1" w:unhideWhenUsed="1"/>
-    <w:lsdException w:name="HTML Preformatted" w:semiHidden="1" w:unhideWhenUsed="1"/>
-    <w:lsdException w:name="HTML Sample" w:semiHidden="1" w:unhideWhenUsed="1"/>
-    <w:lsdException w:name="HTML Typewriter" w:semiHidden="1" w:unhideWhenUsed="1"/>
-    <w:lsdException w:name="HTML Variable" w:semiHidden="1" w:unhideWhenUsed="1"/>
-    <w:lsdException w:name="Normal Table" w:semiHidden="1" w:unhideWhenUsed="1"/>
-    <w:lsdException w:name="annotation subject" w:semiHidden="1" w:unhideWhenUsed="1"/>
-    <w:lsdException w:name="No List" w:semiHidden="1" w:unhideWhenUsed="1"/>
-    <w:lsdException w:name="Outline List 1" w:semiHidden="1" w:unhideWhenUsed="1"/>
-    <w:lsdException w:name="Outline List 2" w:semiHidden="1" w:unhideWhenUsed="1"/>
-    <w:lsdException w:name="Outline List 3" w:semiHidden="1" w:unhideWhenUsed="1"/>
-    <w:lsdException w:name="Table Simple 1" w:semiHidden="1" w:unhideWhenUsed="1"/>
-    <w:lsdException w:name="Table Simple 2" w:semiHidden="1" w:unhideWhenUsed="1"/>
-    <w:lsdException w:name="Table Simple 3" w:semiHidden="1" w:unhideWhenUsed="1"/>
-    <w:lsdException w:name="Table Classic 1" w:semiHidden="1" w:unhideWhenUsed="1"/>
-    <w:lsdException w:name="Table Classic 2" w:semiHidden="1" w:unhideWhenUsed="1"/>
-    <w:lsdException w:name="Table Classic 3" w:semiHidden="1" w:unhideWhenUsed="1"/>
-    <w:lsdException w:name="Table Classic 4" w:semiHidden="1" w:unhideWhenUsed="1"/>
-    <w:lsdException w:name="Table Colorful 1" w:semiHidden="1" w:unhideWhenUsed="1"/>
-    <w:lsdException w:name="Table Colorful 2" w:semiHidden="1" w:unhideWhenUsed="1"/>
-    <w:lsdException w:name="Table Colorful 3" w:semiHidden="1" w:unhideWhenUsed="1"/>
-    <w:lsdException w:name="Table Columns 1" w:semiHidden="1" w:unhideWhenUsed="1"/>
-    <w:lsdException w:name="Table Columns 2" w:semiHidden="1" w:unhideWhenUsed="1"/>
-    <w:lsdException w:name="Table Columns 3" w:semiHidden="1" w:unhideWhenUsed="1"/>
-    <w:lsdException w:name="Table Columns 4" w:semiHidden="1" w:unhideWhenUsed="1"/>
-    <w:lsdException w:name="Table Columns 5" w:semiHidden="1" w:unhideWhenUsed="1"/>
-    <w:lsdException w:name="Table Grid 1" w:semiHidden="1" w:unhideWhenUsed="1"/>
-    <w:lsdException w:name="Table Grid 2" w:semiHidden="1" w:unhideWhenUsed="1"/>
-    <w:lsdException w:name="Table Grid 3" w:semiHidden="1" w:unhideWhenUsed="1"/>
-    <w:lsdException w:name="Table Grid 4" w:semiHidden="1" w:unhideWhenUsed="1"/>
-    <w:lsdException w:name="Table Grid 5" w:semiHidden="1" w:unhideWhenUsed="1"/>
-    <w:lsdException w:name="Table Grid 6" w:semiHidden="1" w:unhideWhenUsed="1"/>
-    <w:lsdException w:name="Table Grid 7" w:semiHidden="1" w:unhideWhenUsed="1"/>
-    <w:lsdException w:name="Table Grid 8" w:semiHidden="1" w:unhideWhenUsed="1"/>
-    <w:lsdException w:name="Table List 1" w:semiHidden="1" w:unhideWhenUsed="1"/>
-    <w:lsdException w:name="Table List 2" w:semiHidden="1" w:unhideWhenUsed="1"/>
-    <w:lsdException w:name="Table List 3" w:semiHidden="1" w:unhideWhenUsed="1"/>
-    <w:lsdException w:name="Table List 4" w:semiHidden="1" w:unhideWhenUsed="1"/>
-    <w:lsdException w:name="Table List 5" w:semiHidden="1" w:unhideWhenUsed="1"/>
-    <w:lsdException w:name="Table List 6" w:semiHidden="1" w:unhideWhenUsed="1"/>
-    <w:lsdException w:name="Table List 7" w:semiHidden="1" w:unhideWhenUsed="1"/>
-    <w:lsdException w:name="Table List 8" w:semiHidden="1" w:unhideWhenUsed="1"/>
-    <w:lsdException w:name="Table 3D effects 1" w:semiHidden="1" w:unhideWhenUsed="1"/>
-    <w:lsdException w:name="Table 3D effects 2" w:semiHidden="1" w:unhideWhenUsed="1"/>
-    <w:lsdException w:name="Table 3D effects 3" w:semiHidden="1" w:unhideWhenUsed="1"/>
-    <w:lsdException w:name="Table Contemporary" w:semiHidden="1" w:unhideWhenUsed="1"/>
-    <w:lsdException w:name="Table Elegant" w:semiHidden="1" w:unhideWhenUsed="1"/>
-    <w:lsdException w:name="Table Professional" w:semiHidden="1" w:unhideWhenUsed="1"/>
-    <w:lsdException w:name="Table Subtle 1" w:semiHidden="1" w:unhideWhenUsed="1"/>
-    <w:lsdException w:name="Table Subtle 2" w:semiHidden="1" w:unhideWhenUsed="1"/>
-    <w:lsdException w:name="Table Web 1" w:semiHidden="1" w:unhideWhenUsed="1"/>
-    <w:lsdException w:name="Table Web 2" w:semiHidden="1" w:unhideWhenUsed="1"/>
-    <w:lsdException w:name="Table Web 3" w:semiHidden="1" w:unhideWhenUsed="1"/>
-    <w:lsdException w:name="Balloon Text" w:semiHidden="1" w:unhideWhenUsed="1"/>
-    <w:lsdException w:name="Table Grid" w:uiPriority="39"/>
-    <w:lsdException w:name="Table Theme" w:semiHidden="1" w:unhideWhenUsed="1"/>
-    <w:lsdException w:name="Placeholder Text" w:semiHidden="1"/>
-    <w:lsdException w:name="No Spacing" w:uiPriority="1" w:qFormat="1"/>
-    <w:lsdException w:name="Light Shading" w:uiPriority="60"/>
-    <w:lsdException w:name="Light List" w:uiPriority="61"/>
-    <w:lsdException w:name="Light Grid" w:uiPriority="62"/>
-    <w:lsdException w:name="Medium Shading 1" w:uiPriority="63"/>
-    <w:lsdException w:name="Medium Shading 2" w:uiPriority="64"/>
-    <w:lsdException w:name="Medium List 1" w:uiPriority="65"/>
-    <w:lsdException w:name="Medium List 2" w:uiPriority="66"/>
-    <w:lsdException w:name="Medium Grid 1" w:uiPriority="67"/>
-    <w:lsdException w:name="Medium Grid 2" w:uiPriority="68"/>
-    <w:lsdException w:name="Medium Grid 3" w:uiPriority="69"/>
-    <w:lsdException w:name="Dark List" w:uiPriority="70"/>
-    <w:lsdException w:name="Colorful Shading" w:uiPriority="71"/>
-    <w:lsdException w:name="Colorful List" w:uiPriority="72"/>
-    <w:lsdException w:name="Colorful Grid" w:uiPriority="73"/>
-    <w:lsdException w:name="Light Shading Accent 1" w:uiPriority="60"/>
-    <w:lsdException w:name="Light List Accent 1" w:uiPriority="61"/>
-    <w:lsdException w:name="Light Grid Accent 1" w:uiPriority="62"/>
-    <w:lsdException w:name="Medium Shading 1 Accent 1" w:uiPriority="63"/>
-    <w:lsdException w:name="Medium Shading 2 Accent 1" w:uiPriority="64"/>
-    <w:lsdException w:name="Medium List 1 Accent 1" w:uiPriority="65"/>
-    <w:lsdException w:name="Revision" w:semiHidden="1"/>
-    <w:lsdException w:name="List Paragraph" w:uiPriority="34" w:qFormat="1"/>
-    <w:lsdException w:name="Quote" w:uiPriority="29" w:qFormat="1"/>
-    <w:lsdException w:name="Intense Quote" w:uiPriority="30" w:qFormat="1"/>
-    <w:lsdException w:name="Medium List 2 Accent 1" w:uiPriority="66"/>
-    <w:lsdException w:name="Medium Grid 1 Accent 1" w:uiPriority="67"/>
-    <w:lsdException w:name="Medium Grid 2 Accent 1" w:uiPriority="68"/>
-    <w:lsdException w:name="Medium Grid 3 Accent 1" w:uiPriority="69"/>
-    <w:lsdException w:name="Dark List Accent 1" w:uiPriority="70"/>
-    <w:lsdException w:name="Colorful Shading Accent 1" w:uiPriority="71"/>
-    <w:lsdException w:name="Colorful List Accent 1" w:uiPriority="72"/>
-    <w:lsdException w:name="Colorful Grid Accent 1" w:uiPriority="73"/>
-    <w:lsdException w:name="Light Shading Accent 2" w:uiPriority="60"/>
-    <w:lsdException w:name="Light List Accent 2" w:uiPriority="61"/>
-    <w:lsdException w:name="Light Grid Accent 2" w:uiPriority="62"/>
-    <w:lsdException w:name="Medium Shading 1 Accent 2" w:uiPriority="63"/>
-    <w:lsdException w:name="Medium Shading 2 Accent 2" w:uiPriority="64"/>
-    <w:lsdException w:name="Medium List 1 Accent 2" w:uiPriority="65"/>
-    <w:lsdException w:name="Medium List 2 Accent 2" w:uiPriority="66"/>
-    <w:lsdException w:name="Medium Grid 1 Accent 2" w:uiPriority="67"/>
-    <w:lsdException w:name="Medium Grid 2 Accent 2" w:uiPriority="68"/>
-    <w:lsdException w:name="Medium Grid 3 Accent 2" w:uiPriority="69"/>
-    <w:lsdException w:name="Dark List Accent 2" w:uiPriority="70"/>
-    <w:lsdException w:name="Colorful Shading Accent 2" w:uiPriority="71"/>
-    <w:lsdException w:name="Colorful List Accent 2" w:uiPriority="72"/>
-    <w:lsdException w:name="Colorful Grid Accent 2" w:uiPriority="73"/>
-    <w:lsdException w:name="Light Shading Accent 3" w:uiPriority="60"/>
-    <w:lsdException w:name="Light List Accent 3" w:uiPriority="61"/>
-    <w:lsdException w:name="Light Grid Accent 3" w:uiPriority="62"/>
-    <w:lsdException w:name="Medium Shading 1 Accent 3" w:uiPriority="63"/>
-    <w:lsdException w:name="Medium Shading 2 Accent 3" w:uiPriority="64"/>
-    <w:lsdException w:name="Medium List 1 Accent 3" w:uiPriority="65"/>
-    <w:lsdException w:name="Medium List 2 Accent 3" w:uiPriority="66"/>
-    <w:lsdException w:name="Medium Grid 1 Accent 3" w:uiPriority="67"/>
-    <w:lsdException w:name="Medium Grid 2 Accent 3" w:uiPriority="68"/>
-    <w:lsdException w:name="Medium Grid 3 Accent 3" w:uiPriority="69"/>
-    <w:lsdException w:name="Dark List Accent 3" w:uiPriority="70"/>
-    <w:lsdException w:name="Colorful Shading Accent 3" w:uiPriority="71"/>
-    <w:lsdException w:name="Colorful List Accent 3" w:uiPriority="72"/>
-    <w:lsdException w:name="Colorful Grid Accent 3" w:uiPriority="73"/>
-    <w:lsdException w:name="Light Shading Accent 4" w:uiPriority="60"/>
-    <w:lsdException w:name="Light List Accent 4" w:uiPriority="61"/>
-    <w:lsdException w:name="Light Grid Accent 4" w:uiPriority="62"/>
-    <w:lsdException w:name="Medium Shading 1 Accent 4" w:uiPriority="63"/>
-    <w:lsdException w:name="Medium Shading 2 Accent 4" w:uiPriority="64"/>
-    <w:lsdException w:name="Medium List 1 Accent 4" w:uiPriority="65"/>
-    <w:lsdException w:name="Medium List 2 Accent 4" w:uiPriority="66"/>
-    <w:lsdException w:name="Medium Grid 1 Accent 4" w:uiPriority="67"/>
-    <w:lsdException w:name="Medium Grid 2 Accent 4" w:uiPriority="68"/>
-    <w:lsdException w:name="Medium Grid 3 Accent 4" w:uiPriority="69"/>
-    <w:lsdException w:name="Dark List Accent 4" w:uiPriority="70"/>
-    <w:lsdException w:name="Colorful Shading Accent 4" w:uiPriority="71"/>
-    <w:lsdException w:name="Colorful List Accent 4" w:uiPriority="72"/>
-    <w:lsdException w:name="Colorful Grid Accent 4" w:uiPriority="73"/>
-    <w:lsdException w:name="Light Shading Accent 5" w:uiPriority="60"/>
-    <w:lsdException w:name="Light List Accent 5" w:uiPriority="61"/>
-    <w:lsdException w:name="Light Grid Accent 5" w:uiPriority="62"/>
-    <w:lsdException w:name="Medium Shading 1 Accent 5" w:uiPriority="63"/>
-    <w:lsdException w:name="Medium Shading 2 Accent 5" w:uiPriority="64"/>
-    <w:lsdException w:name="Medium List 1 Accent 5" w:uiPriority="65"/>
-    <w:lsdException w:name="Medium List 2 Accent 5" w:uiPriority="66"/>
-    <w:lsdException w:name="Medium Grid 1 Accent 5" w:uiPriority="67"/>
-    <w:lsdException w:name="Medium Grid 2 Accent 5" w:uiPriority="68"/>
-    <w:lsdException w:name="Medium Grid 3 Accent 5" w:uiPriority="69"/>
-    <w:lsdException w:name="Dark List Accent 5" w:uiPriority="70"/>
-    <w:lsdException w:name="Colorful Shading Accent 5" w:uiPriority="71"/>
-    <w:lsdException w:name="Colorful List Accent 5" w:uiPriority="72"/>
-    <w:lsdException w:name="Colorful Grid Accent 5" w:uiPriority="73"/>
-    <w:lsdException w:name="Light Shading Accent 6" w:uiPriority="60"/>
-    <w:lsdException w:name="Light List Accent 6" w:uiPriority="61"/>
-    <w:lsdException w:name="Light Grid Accent 6" w:uiPriority="62"/>
-    <w:lsdException w:name="Medium Shading 1 Accent 6" w:uiPriority="63"/>
-    <w:lsdException w:name="Medium Shading 2 Accent 6" w:uiPriority="64"/>
-    <w:lsdException w:name="Medium List 1 Accent 6" w:uiPriority="65"/>
-    <w:lsdException w:name="Medium List 2 Accent 6" w:uiPriority="66"/>
-    <w:lsdException w:name="Medium Grid 1 Accent 6" w:uiPriority="67"/>
-    <w:lsdException w:name="Medium Grid 2 Accent 6" w:uiPriority="68"/>
-    <w:lsdException w:name="Medium Grid 3 Accent 6" w:uiPriority="69"/>
-    <w:lsdException w:name="Dark List Accent 6" w:uiPriority="70"/>
-    <w:lsdException w:name="Colorful Shading Accent 6" w:uiPriority="71"/>
-    <w:lsdException w:name="Colorful List Accent 6" w:uiPriority="72"/>
-    <w:lsdException w:name="Colorful Grid Accent 6" w:uiPriority="73"/>
-    <w:lsdException w:name="Subtle Emphasis" w:uiPriority="19" w:qFormat="1"/>
-    <w:lsdException w:name="Intense Emphasis" w:uiPriority="21" w:qFormat="1"/>
-    <w:lsdException w:name="Subtle Reference" w:uiPriority="31" w:qFormat="1"/>
-    <w:lsdException w:name="Intense Reference" w:uiPriority="32" w:qFormat="1"/>
-    <w:lsdException w:name="Book Title" w:uiPriority="33" w:qFormat="1"/>
-    <w:lsdException w:name="Bibliography" w:semiHidden="1" w:uiPriority="37" w:unhideWhenUsed="1"/>
-    <w:lsdException w:name="TOC Heading" w:semiHidden="1" w:uiPriority="39" w:unhideWhenUsed="1" w:qFormat="1"/>
-    <w:lsdException w:name="Plain Table 1" w:uiPriority="41"/>
-    <w:lsdException w:name="Plain Table 2" w:uiPriority="42"/>
-    <w:lsdException w:name="Plain Table 3" w:uiPriority="43"/>
-    <w:lsdException w:name="Plain Table 4" w:uiPriority="44"/>
-    <w:lsdException w:name="Plain Table 5" w:uiPriority="45"/>
-    <w:lsdException w:name="Grid Table Light" w:uiPriority="40"/>
-    <w:lsdException w:name="Grid Table 1 Light" w:uiPriority="46"/>
-    <w:lsdException w:name="Grid Table 2" w:uiPriority="47"/>
-    <w:lsdException w:name="Grid Table 3" w:uiPriority="48"/>
-    <w:lsdException w:name="Grid Table 4" w:uiPriority="49"/>
-    <w:lsdException w:name="Grid Table 5 Dark" w:uiPriority="50"/>
-    <w:lsdException w:name="Grid Table 6 Colorful" w:uiPriority="51"/>
-    <w:lsdException w:name="Grid Table 7 Colorful" w:uiPriority="52"/>
-    <w:lsdException w:name="Grid Table 1 Light Accent 1" w:uiPriority="46"/>
-    <w:lsdException w:name="Grid Table 2 Accent 1" w:uiPriority="47"/>
-    <w:lsdException w:name="Grid Table 3 Accent 1" w:uiPriority="48"/>
-    <w:lsdException w:name="Grid Table 4 Accent 1" w:uiPriority="49"/>
-    <w:lsdException w:name="Grid Table 5 Dark Accent 1" w:uiPriority="50"/>
-    <w:lsdException w:name="Grid Table 6 Colorful Accent 1" w:uiPriority="51"/>
-    <w:lsdException w:name="Grid Table 7 Colorful Accent 1" w:uiPriority="52"/>
-    <w:lsdException w:name="Grid Table 1 Light Accent 2" w:uiPriority="46"/>
-    <w:lsdException w:name="Grid Table 2 Accent 2" w:uiPriority="47"/>
-    <w:lsdException w:name="Grid Table 3 Accent 2" w:uiPriority="48"/>
-    <w:lsdException w:name="Grid Table 4 Accent 2" w:uiPriority="49"/>
-    <w:lsdException w:name="Grid Table 5 Dark Accent 2" w:uiPriority="50"/>
-    <w:lsdException w:name="Grid Table 6 Colorful Accent 2" w:uiPriority="51"/>
-    <w:lsdException w:name="Grid Table 7 Colorful Accent 2" w:uiPriority="52"/>
-    <w:lsdException w:name="Grid Table 1 Light Accent 3" w:uiPriority="46"/>
-    <w:lsdException w:name="Grid Table 2 Accent 3" w:uiPriority="47"/>
-    <w:lsdException w:name="Grid Table 3 Accent 3" w:uiPriority="48"/>
-    <w:lsdException w:name="Grid Table 4 Accent 3" w:uiPriority="49"/>
-    <w:lsdException w:name="Grid Table 5 Dark Accent 3" w:uiPriority="50"/>
-    <w:lsdException w:name="Grid Table 6 Colorful Accent 3" w:uiPriority="51"/>
-    <w:lsdException w:name="Grid Table 7 Colorful Accent 3" w:uiPriority="52"/>
-    <w:lsdException w:name="Grid Table 1 Light Accent 4" w:uiPriority="46"/>
-    <w:lsdException w:name="Grid Table 2 Accent 4" w:uiPriority="47"/>
-    <w:lsdException w:name="Grid Table 3 Accent 4" w:uiPriority="48"/>
-    <w:lsdException w:name="Grid Table 4 Accent 4" w:uiPriority="49"/>
-    <w:lsdException w:name="Grid Table 5 Dark Accent 4" w:uiPriority="50"/>
-    <w:lsdException w:name="Grid Table 6 Colorful Accent 4" w:uiPriority="51"/>
-    <w:lsdException w:name="Grid Table 7 Colorful Accent 4" w:uiPriority="52"/>
-    <w:lsdException w:name="Grid Table 1 Light Accent 5" w:uiPriority="46"/>
-    <w:lsdException w:name="Grid Table 2 Accent 5" w:uiPriority="47"/>
-    <w:lsdException w:name="Grid Table 3 Accent 5" w:uiPriority="48"/>
-    <w:lsdException w:name="Grid Table 4 Accent 5" w:uiPriority="49"/>
-    <w:lsdException w:name="Grid Table 5 Dark Accent 5" w:uiPriority="50"/>
-    <w:lsdException w:name="Grid Table 6 Colorful Accent 5" w:uiPriority="51"/>
-    <w:lsdException w:name="Grid Table 7 Colorful Accent 5" w:uiPriority="52"/>
-    <w:lsdException w:name="Grid Table 1 Light Accent 6" w:uiPriority="46"/>
-    <w:lsdException w:name="Grid Table 2 Accent 6" w:uiPriority="47"/>
-    <w:lsdException w:name="Grid Table 3 Accent 6" w:uiPriority="48"/>
-    <w:lsdException w:name="Grid Table 4 Accent 6" w:uiPriority="49"/>
-    <w:lsdException w:name="Grid Table 5 Dark Accent 6" w:uiPriority="50"/>
-    <w:lsdException w:name="Grid Table 6 Colorful Accent 6" w:uiPriority="51"/>
-    <w:lsdException w:name="Grid Table 7 Colorful Accent 6" w:uiPriority="52"/>
-    <w:lsdException w:name="List Table 1 Light" w:uiPriority="46"/>
-    <w:lsdException w:name="List Table 2" w:uiPriority="47"/>
-    <w:lsdException w:name="List Table 3" w:uiPriority="48"/>
-    <w:lsdException w:name="List Table 4" w:uiPriority="49"/>
-    <w:lsdException w:name="List Table 5 Dark" w:uiPriority="50"/>
-    <w:lsdException w:name="List Table 6 Colorful" w:uiPriority="51"/>
-    <w:lsdException w:name="List Table 7 Colorful" w:uiPriority="52"/>
-    <w:lsdException w:name="List Table 1 Light Accent 1" w:uiPriority="46"/>
-    <w:lsdException w:name="List Table 2 Accent 1" w:uiPriority="47"/>
-    <w:lsdException w:name="List Table 3 Accent 1" w:uiPriority="48"/>
-    <w:lsdException w:name="List Table 4 Accent 1" w:uiPriority="49"/>
-    <w:lsdException w:name="List Table 5 Dark Accent 1" w:uiPriority="50"/>
-    <w:lsdException w:name="List Table 6 Colorful Accent 1" w:uiPriority="51"/>
-    <w:lsdException w:name="List Table 7 Colorful Accent 1" w:uiPriority="52"/>
-    <w:lsdException w:name="List Table 1 Light Accent 2" w:uiPriority="46"/>
-    <w:lsdException w:name="List Table 2 Accent 2" w:uiPriority="47"/>
-    <w:lsdException w:name="List Table 3 Accent 2" w:uiPriority="48"/>
-    <w:lsdException w:name="List Table 4 Accent 2" w:uiPriority="49"/>
-    <w:lsdException w:name="List Table 5 Dark Accent 2" w:uiPriority="50"/>
-    <w:lsdException w:name="List Table 6 Colorful Accent 2" w:uiPriority="51"/>
-    <w:lsdException w:name="List Table 7 Colorful Accent 2" w:uiPriority="52"/>
-    <w:lsdException w:name="List Table 1 Light Accent 3" w:uiPriority="46"/>
-    <w:lsdException w:name="List Table 2 Accent 3" w:uiPriority="47"/>
-    <w:lsdException w:name="List Table 3 Accent 3" w:uiPriority="48"/>
-    <w:lsdException w:name="List Table 4 Accent 3" w:uiPriority="49"/>
-    <w:lsdException w:name="List Table 5 Dark Accent 3" w:uiPriority="50"/>
-    <w:lsdException w:name="List Table 6 Colorful Accent 3" w:uiPriority="51"/>
-    <w:lsdException w:name="List Table 7 Colorful Accent 3" w:uiPriority="52"/>
-    <w:lsdException w:name="List Table 1 Light Accent 4" w:uiPriority="46"/>
-    <w:lsdException w:name="List Table 2 Accent 4" w:uiPriority="47"/>
-    <w:lsdException w:name="List Table 3 Accent 4" w:uiPriority="48"/>
-    <w:lsdException w:name="List Table 4 Accent 4" w:uiPriority="49"/>
-    <w:lsdException w:name="List Table 5 Dark Accent 4" w:uiPriority="50"/>
-    <w:lsdException w:name="List Table 6 Colorful Accent 4" w:uiPriority="51"/>
-    <w:lsdException w:name="List Table 7 Colorful Accent 4" w:uiPriority="52"/>
-    <w:lsdException w:name="List Table 1 Light Accent 5" w:uiPriority="46"/>
-    <w:lsdException w:name="List Table 2 Accent 5" w:uiPriority="47"/>
-    <w:lsdException w:name="List Table 3 Accent 5" w:uiPriority="48"/>
-    <w:lsdException w:name="List Table 4 Accent 5" w:uiPriority="49"/>
-    <w:lsdException w:name="List Table 5 Dark Accent 5" w:uiPriority="50"/>
-    <w:lsdException w:name="List Table 6 Colorful Accent 5" w:uiPriority="51"/>
-    <w:lsdException w:name="List Table 7 Colorful Accent 5" w:uiPriority="52"/>
-    <w:lsdException w:name="List Table 1 Light Accent 6" w:uiPriority="46"/>
-    <w:lsdException w:name="List Table 2 Accent 6" w:uiPriority="47"/>
-    <w:lsdException w:name="List Table 3 Accent 6" w:uiPriority="48"/>
-    <w:lsdException w:name="List Table 4 Accent 6" w:uiPriority="49"/>
-    <w:lsdException w:name="List Table 5 Dark Accent 6" w:uiPriority="50"/>
-    <w:lsdException w:name="List Table 6 Colorful Accent 6" w:uiPriority="51"/>
-    <w:lsdException w:name="List Table 7 Colorful Accent 6" w:uiPriority="52"/>
-  </w:latentStyles>
-  <w:style w:type="paragraph" w:default="1" w:styleId="Normal">
-    <w:name w:val="Normal"/>
-    <w:qFormat/>
-  </w:style>
-  <w:style w:type="character" w:default="1" w:styleId="Fuentedeprrafopredeter">
-    <w:name w:val="Default Paragraph Font"/>
-    <w:uiPriority w:val="1"/>
-    <w:semiHidden/>
-    <w:unhideWhenUsed/>
-  </w:style>
-  <w:style w:type="table" w:default="1" w:styleId="Tablanormal">
-    <w:name w:val="Normal Table"/>
-    <w:uiPriority w:val="99"/>
-    <w:semiHidden/>
-    <w:unhideWhenUsed/>
-    <w:tblPr>
-      <w:tblInd w:w="0" w:type="dxa"/>
-      <w:tblCellMar>
-        <w:top w:w="0" w:type="dxa"/>
-        <w:left w:w="108" w:type="dxa"/>
-        <w:bottom w:w="0" w:type="dxa"/>
-        <w:right w:w="108" w:type="dxa"/>
-      </w:tblCellMar>
-    </w:tblPr>
-  </w:style>
-  <w:style w:type="numbering" w:default="1" w:styleId="Sinlista">
-    <w:name w:val="No List"/>
-    <w:uiPriority w:val="99"/>
-    <w:semiHidden/>
-    <w:unhideWhenUsed/>
-  </w:style>
-</w:styles>
-</file>
-
-<file path=word/glossary/webSettings.xml><?xml version="1.0" encoding="utf-8"?>
-<w:webSettings xmlns:mc="http://schemas.openxmlformats.org/markup-compatibility/2006" xmlns:r="http://schemas.openxmlformats.org/officeDocument/2006/relationships" xmlns:w="http://schemas.openxmlformats.org/wordprocessingml/2006/main" xmlns:w14="http://schemas.microsoft.com/office/word/2010/wordml" xmlns:w15="http://schemas.microsoft.com/office/word/2012/wordml" xmlns:w16se="http://schemas.microsoft.com/office/word/2015/wordml/symex" mc:Ignorable="w14 w15 w16se"/>
 </file>
 
 <file path=word/theme/theme1.xml><?xml version="1.0" encoding="utf-8"?>
@@ -9000,6 +8436,25 @@
 </file>
 
 <file path=customXml/item1.xml><?xml version="1.0" encoding="utf-8"?>
+<b:Sources xmlns:b="http://schemas.openxmlformats.org/officeDocument/2006/bibliography" xmlns="http://schemas.openxmlformats.org/officeDocument/2006/bibliography" SelectedStyle="\APASixthEditionOfficeOnline.xsl" StyleName="APA" Version="6"/>
+</file>
+
+<file path=customXml/item2.xml><?xml version="1.0" encoding="utf-8"?>
+<?mso-contentType ?>
+<FormTemplates xmlns="http://schemas.microsoft.com/sharepoint/v3/contenttype/forms">
+  <Display>DocumentLibraryForm</Display>
+  <Edit>DocumentLibraryForm</Edit>
+  <New>DocumentLibraryForm</New>
+</FormTemplates>
+</file>
+
+<file path=customXml/item3.xml><?xml version="1.0" encoding="utf-8"?>
+<p:properties xmlns:p="http://schemas.microsoft.com/office/2006/metadata/properties" xmlns:xsi="http://www.w3.org/2001/XMLSchema-instance" xmlns:pc="http://schemas.microsoft.com/office/infopath/2007/PartnerControls">
+  <documentManagement/>
+</p:properties>
+</file>
+
+<file path=customXml/item4.xml><?xml version="1.0" encoding="utf-8"?>
 <ct:contentTypeSchema xmlns:ct="http://schemas.microsoft.com/office/2006/metadata/contentType" xmlns:ma="http://schemas.microsoft.com/office/2006/metadata/properties/metaAttributes" ct:_="" ma:_="" ma:contentTypeName="Documento" ma:contentTypeID="0x010100E96778489EE7714D8BD12CC105EB918B" ma:contentTypeVersion="2" ma:contentTypeDescription="Crear nuevo documento." ma:contentTypeScope="" ma:versionID="416c5c7ae9b5d54d83875cd3c65194e3">
   <xsd:schema xmlns:xsd="http://www.w3.org/2001/XMLSchema" xmlns:xs="http://www.w3.org/2001/XMLSchema" xmlns:p="http://schemas.microsoft.com/office/2006/metadata/properties" xmlns:ns2="126e8a1c-9ea9-435a-ac89-d06c80d62e30" targetNamespace="http://schemas.microsoft.com/office/2006/metadata/properties" ma:root="true" ma:fieldsID="70a237c842677bd850644f8595079f5e" ns2:_="">
     <xsd:import namespace="126e8a1c-9ea9-435a-ac89-d06c80d62e30"/>
@@ -9131,26 +8586,32 @@
 </ct:contentTypeSchema>
 </file>
 
-<file path=customXml/item2.xml><?xml version="1.0" encoding="utf-8"?>
-<p:properties xmlns:p="http://schemas.microsoft.com/office/2006/metadata/properties" xmlns:xsi="http://www.w3.org/2001/XMLSchema-instance" xmlns:pc="http://schemas.microsoft.com/office/infopath/2007/PartnerControls">
-  <documentManagement/>
-</p:properties>
+<file path=customXml/itemProps1.xml><?xml version="1.0" encoding="utf-8"?>
+<ds:datastoreItem xmlns:ds="http://schemas.openxmlformats.org/officeDocument/2006/customXml" ds:itemID="{FBD61725-A60E-40F3-AB5D-0E7F797DD77D}">
+  <ds:schemaRefs>
+    <ds:schemaRef ds:uri="http://schemas.openxmlformats.org/officeDocument/2006/bibliography"/>
+  </ds:schemaRefs>
+</ds:datastoreItem>
 </file>
 
-<file path=customXml/item3.xml><?xml version="1.0" encoding="utf-8"?>
-<?mso-contentType ?>
-<FormTemplates xmlns="http://schemas.microsoft.com/sharepoint/v3/contenttype/forms">
-  <Display>DocumentLibraryForm</Display>
-  <Edit>DocumentLibraryForm</Edit>
-  <New>DocumentLibraryForm</New>
-</FormTemplates>
+<file path=customXml/itemProps2.xml><?xml version="1.0" encoding="utf-8"?>
+<ds:datastoreItem xmlns:ds="http://schemas.openxmlformats.org/officeDocument/2006/customXml" ds:itemID="{DABAA964-10BA-4DBC-ABF2-CDEAC0FAF7AA}">
+  <ds:schemaRefs>
+    <ds:schemaRef ds:uri="http://schemas.microsoft.com/sharepoint/v3/contenttype/forms"/>
+  </ds:schemaRefs>
+</ds:datastoreItem>
 </file>
 
-<file path=customXml/item4.xml><?xml version="1.0" encoding="utf-8"?>
-<b:Sources xmlns:b="http://schemas.openxmlformats.org/officeDocument/2006/bibliography" xmlns="http://schemas.openxmlformats.org/officeDocument/2006/bibliography" SelectedStyle="\APASixthEditionOfficeOnline.xsl" StyleName="APA" Version="6"/>
+<file path=customXml/itemProps3.xml><?xml version="1.0" encoding="utf-8"?>
+<ds:datastoreItem xmlns:ds="http://schemas.openxmlformats.org/officeDocument/2006/customXml" ds:itemID="{5F1783E3-BA1C-4CA3-8E32-C9B378BBED03}">
+  <ds:schemaRefs>
+    <ds:schemaRef ds:uri="http://schemas.microsoft.com/office/2006/metadata/properties"/>
+    <ds:schemaRef ds:uri="http://schemas.microsoft.com/office/infopath/2007/PartnerControls"/>
+  </ds:schemaRefs>
+</ds:datastoreItem>
 </file>
 
-<file path=customXml/itemProps1.xml><?xml version="1.0" encoding="utf-8"?>
+<file path=customXml/itemProps4.xml><?xml version="1.0" encoding="utf-8"?>
 <ds:datastoreItem xmlns:ds="http://schemas.openxmlformats.org/officeDocument/2006/customXml" ds:itemID="{DF0582E6-0C2C-40A6-8E3D-E410E41021C1}">
   <ds:schemaRefs>
     <ds:schemaRef ds:uri="http://schemas.microsoft.com/office/2006/metadata/contentType"/>
@@ -9166,36 +8627,4 @@
     <ds:schemaRef ds:uri="http://schemas.microsoft.com/internal/obd"/>
   </ds:schemaRefs>
 </ds:datastoreItem>
-</file>
-
-<file path=customXml/itemProps2.xml><?xml version="1.0" encoding="utf-8"?>
-<ds:datastoreItem xmlns:ds="http://schemas.openxmlformats.org/officeDocument/2006/customXml" ds:itemID="{5F1783E3-BA1C-4CA3-8E32-C9B378BBED03}">
-  <ds:schemaRefs>
-    <ds:schemaRef ds:uri="http://schemas.openxmlformats.org/package/2006/metadata/core-properties"/>
-    <ds:schemaRef ds:uri="http://schemas.microsoft.com/office/infopath/2007/PartnerControls"/>
-    <ds:schemaRef ds:uri="http://purl.org/dc/elements/1.1/"/>
-    <ds:schemaRef ds:uri="http://schemas.microsoft.com/office/2006/documentManagement/types"/>
-    <ds:schemaRef ds:uri="http://schemas.microsoft.com/office/2006/metadata/properties"/>
-    <ds:schemaRef ds:uri="126e8a1c-9ea9-435a-ac89-d06c80d62e30"/>
-    <ds:schemaRef ds:uri="http://purl.org/dc/terms/"/>
-    <ds:schemaRef ds:uri="http://purl.org/dc/dcmitype/"/>
-    <ds:schemaRef ds:uri="http://www.w3.org/XML/1998/namespace"/>
-  </ds:schemaRefs>
-</ds:datastoreItem>
-</file>
-
-<file path=customXml/itemProps3.xml><?xml version="1.0" encoding="utf-8"?>
-<ds:datastoreItem xmlns:ds="http://schemas.openxmlformats.org/officeDocument/2006/customXml" ds:itemID="{DABAA964-10BA-4DBC-ABF2-CDEAC0FAF7AA}">
-  <ds:schemaRefs>
-    <ds:schemaRef ds:uri="http://schemas.microsoft.com/sharepoint/v3/contenttype/forms"/>
-  </ds:schemaRefs>
-</ds:datastoreItem>
-</file>
-
-<file path=customXml/itemProps4.xml><?xml version="1.0" encoding="utf-8"?>
-<ds:datastoreItem xmlns:ds="http://schemas.openxmlformats.org/officeDocument/2006/customXml" ds:itemID="{FBD61725-A60E-40F3-AB5D-0E7F797DD77D}">
-  <ds:schemaRefs>
-    <ds:schemaRef ds:uri="http://schemas.openxmlformats.org/officeDocument/2006/bibliography"/>
-  </ds:schemaRefs>
-</ds:datastoreItem>
 </file>
</xml_diff>